<commit_message>
refactor(docx): add diagrams to reports to Lab 1 & Lab 2
</commit_message>
<xml_diff>
--- a/Lab1/src/main/java/oop1/document/Лаб1_IМ52_Яхновська.docx
+++ b/Lab1/src/main/java/oop1/document/Лаб1_IМ52_Яхновська.docx
@@ -4030,19 +4030,21 @@
         <w:jc w:val="left"/>
         <w:rPr>
           <w:rFonts w:ascii="Times New Roman" w:cs="Times New Roman" w:eastAsia="Times New Roman" w:hAnsi="Times New Roman"/>
+          <w:b w:val="1"/>
+          <w:bCs w:val="1"/>
           <w:color w:val="000000"/>
           <w:sz w:val="32"/>
           <w:szCs w:val="32"/>
-          <w:u w:val="single"/>
-        </w:rPr>
-      </w:pPr>
-      <w:r>
-        <w:rPr>
-          <w:rFonts w:ascii="Times New Roman" w:cs="Times New Roman" w:eastAsia="Times New Roman" w:hAnsi="Times New Roman"/>
+        </w:rPr>
+      </w:pPr>
+      <w:r>
+        <w:rPr>
+          <w:rFonts w:ascii="Times New Roman" w:cs="Times New Roman" w:eastAsia="Times New Roman" w:hAnsi="Times New Roman"/>
+          <w:b w:val="1"/>
+          <w:bCs w:val="1"/>
           <w:color w:val="000000"/>
           <w:sz w:val="32"/>
           <w:szCs w:val="32"/>
-          <w:u w:val="single"/>
           <w:shd w:fill="auto" w:val="clear"/>
           <w:rtl w:val="0"/>
         </w:rPr>
@@ -4066,12 +4068,12 @@
             <wp:extent cx="2947988" cy="2550243"/>
             <wp:effectExtent b="0" l="0" r="0" t="0"/>
             <wp:wrapNone/>
-            <wp:docPr id="10" name="image3.png"/>
+            <wp:docPr id="11" name="image1.png"/>
             <a:graphic>
               <a:graphicData uri="http://schemas.openxmlformats.org/drawingml/2006/picture">
                 <pic:pic>
                   <pic:nvPicPr>
-                    <pic:cNvPr id="0" name="image3.png"/>
+                    <pic:cNvPr id="0" name="image1.png"/>
                     <pic:cNvPicPr preferRelativeResize="0"/>
                   </pic:nvPicPr>
                   <pic:blipFill>
@@ -4127,12 +4129,12 @@
             <wp:extent cx="2786063" cy="2318723"/>
             <wp:effectExtent b="0" l="0" r="0" t="0"/>
             <wp:wrapNone/>
-            <wp:docPr id="8" name="image1.png"/>
+            <wp:docPr id="9" name="image2.png"/>
             <a:graphic>
               <a:graphicData uri="http://schemas.openxmlformats.org/drawingml/2006/picture">
                 <pic:pic>
                   <pic:nvPicPr>
-                    <pic:cNvPr id="0" name="image1.png"/>
+                    <pic:cNvPr id="0" name="image2.png"/>
                     <pic:cNvPicPr preferRelativeResize="0"/>
                   </pic:nvPicPr>
                   <pic:blipFill>
@@ -4191,12 +4193,12 @@
             <wp:extent cx="2790825" cy="2379546"/>
             <wp:effectExtent b="0" l="0" r="0" t="0"/>
             <wp:wrapNone/>
-            <wp:docPr id="11" name="image4.png"/>
+            <wp:docPr id="12" name="image3.png"/>
             <a:graphic>
               <a:graphicData uri="http://schemas.openxmlformats.org/drawingml/2006/picture">
                 <pic:pic>
                   <pic:nvPicPr>
-                    <pic:cNvPr id="0" name="image4.png"/>
+                    <pic:cNvPr id="0" name="image3.png"/>
                     <pic:cNvPicPr preferRelativeResize="0"/>
                   </pic:nvPicPr>
                   <pic:blipFill>
@@ -4233,12 +4235,12 @@
             <wp:extent cx="2790825" cy="2343857"/>
             <wp:effectExtent b="0" l="0" r="0" t="0"/>
             <wp:wrapNone/>
-            <wp:docPr id="12" name="image2.png"/>
+            <wp:docPr id="13" name="image6.png"/>
             <a:graphic>
               <a:graphicData uri="http://schemas.openxmlformats.org/drawingml/2006/picture">
                 <pic:pic>
                   <pic:nvPicPr>
-                    <pic:cNvPr id="0" name="image2.png"/>
+                    <pic:cNvPr id="0" name="image6.png"/>
                     <pic:cNvPicPr preferRelativeResize="0"/>
                   </pic:nvPicPr>
                   <pic:blipFill>
@@ -4275,12 +4277,12 @@
             <wp:extent cx="2790825" cy="2421179"/>
             <wp:effectExtent b="0" l="0" r="0" t="0"/>
             <wp:wrapNone/>
-            <wp:docPr id="9" name="image6.png"/>
+            <wp:docPr id="10" name="image4.png"/>
             <a:graphic>
               <a:graphicData uri="http://schemas.openxmlformats.org/drawingml/2006/picture">
                 <pic:pic>
                   <pic:nvPicPr>
-                    <pic:cNvPr id="0" name="image6.png"/>
+                    <pic:cNvPr id="0" name="image4.png"/>
                     <pic:cNvPicPr preferRelativeResize="0"/>
                   </pic:nvPicPr>
                   <pic:blipFill>
@@ -4317,12 +4319,12 @@
             <wp:extent cx="2790825" cy="2392136"/>
             <wp:effectExtent b="0" l="0" r="0" t="0"/>
             <wp:wrapNone/>
-            <wp:docPr id="13" name="image5.png"/>
+            <wp:docPr id="14" name="image7.png"/>
             <a:graphic>
               <a:graphicData uri="http://schemas.openxmlformats.org/drawingml/2006/picture">
                 <pic:pic>
                   <pic:nvPicPr>
-                    <pic:cNvPr id="0" name="image5.png"/>
+                    <pic:cNvPr id="0" name="image7.png"/>
                     <pic:cNvPicPr preferRelativeResize="0"/>
                   </pic:nvPicPr>
                   <pic:blipFill>
@@ -4349,20 +4351,25 @@
     </w:p>
     <w:p>
       <w:pPr>
-        <w:spacing w:after="160" w:before="0" w:line="259" w:lineRule="auto"/>
-        <w:ind w:left="0" w:right="0" w:firstLine="0"/>
-        <w:jc w:val="left"/>
-        <w:rPr>
-          <w:rFonts w:ascii="Times New Roman" w:cs="Times New Roman" w:eastAsia="Times New Roman" w:hAnsi="Times New Roman"/>
+        <w:spacing w:after="217" w:before="57" w:line="202" w:lineRule="auto"/>
+        <w:rPr>
+          <w:rFonts w:ascii="Times New Roman" w:cs="Times New Roman" w:eastAsia="Times New Roman" w:hAnsi="Times New Roman"/>
+          <w:b w:val="1"/>
+          <w:bCs w:val="1"/>
           <w:sz w:val="32"/>
           <w:szCs w:val="32"/>
-          <w:u w:val="single"/>
-        </w:rPr>
-      </w:pPr>
-      <w:r>
-        <w:rPr>
-          <w:rtl w:val="0"/>
-        </w:rPr>
+        </w:rPr>
+      </w:pPr>
+      <w:r>
+        <w:rPr>
+          <w:rFonts w:ascii="Times New Roman" w:cs="Times New Roman" w:eastAsia="Times New Roman" w:hAnsi="Times New Roman"/>
+          <w:b w:val="1"/>
+          <w:bCs w:val="1"/>
+          <w:sz w:val="32"/>
+          <w:szCs w:val="32"/>
+          <w:rtl w:val="0"/>
+        </w:rPr>
+        <w:t xml:space="preserve">Діаграма залежностей файлів та модулів</w:t>
       </w:r>
     </w:p>
     <w:p>
@@ -4395,6 +4402,48 @@
           <w:rtl w:val="0"/>
         </w:rPr>
       </w:r>
+      <w:r>
+        <w:drawing>
+          <wp:anchor allowOverlap="1" behindDoc="0" distB="114300" distT="114300" distL="114300" distR="114300" hidden="0" layoutInCell="1" locked="0" relativeHeight="0" simplePos="0">
+            <wp:simplePos x="0" y="0"/>
+            <wp:positionH relativeFrom="column">
+              <wp:posOffset>857250</wp:posOffset>
+            </wp:positionH>
+            <wp:positionV relativeFrom="paragraph">
+              <wp:posOffset>238125</wp:posOffset>
+            </wp:positionV>
+            <wp:extent cx="4329113" cy="2614089"/>
+            <wp:effectExtent b="0" l="0" r="0" t="0"/>
+            <wp:wrapTopAndBottom distB="114300" distT="114300"/>
+            <wp:docPr id="8" name="image5.png"/>
+            <a:graphic>
+              <a:graphicData uri="http://schemas.openxmlformats.org/drawingml/2006/picture">
+                <pic:pic>
+                  <pic:nvPicPr>
+                    <pic:cNvPr id="0" name="image5.png"/>
+                    <pic:cNvPicPr preferRelativeResize="0"/>
+                  </pic:nvPicPr>
+                  <pic:blipFill>
+                    <a:blip r:embed="rId13"/>
+                    <a:srcRect b="0" l="0" r="0" t="0"/>
+                    <a:stretch>
+                      <a:fillRect/>
+                    </a:stretch>
+                  </pic:blipFill>
+                  <pic:spPr>
+                    <a:xfrm>
+                      <a:off x="0" y="0"/>
+                      <a:ext cx="4329113" cy="2614089"/>
+                    </a:xfrm>
+                    <a:prstGeom prst="rect"/>
+                    <a:ln/>
+                  </pic:spPr>
+                </pic:pic>
+              </a:graphicData>
+            </a:graphic>
+          </wp:anchor>
+        </w:drawing>
+      </w:r>
     </w:p>
     <w:p>
       <w:pPr>
@@ -4443,7 +4492,7 @@
       </w:r>
     </w:p>
     <w:sectPr>
-      <w:headerReference r:id="rId13" w:type="default"/>
+      <w:headerReference r:id="rId14" w:type="default"/>
       <w:pgSz w:h="15840" w:w="12240" w:orient="portrait"/>
       <w:pgMar w:bottom="1440" w:top="1440" w:left="1440" w:right="1440" w:header="0" w:footer="0"/>
       <w:pgNumType w:start="1"/>

</xml_diff>

<commit_message>
refactor(docx): reupload correct version report to Lab 1
</commit_message>
<xml_diff>
--- a/Lab1/src/main/java/oop1/document/Лаб1_IМ52_Яхновська.docx
+++ b/Lab1/src/main/java/oop1/document/Лаб1_IМ52_Яхновська.docx
@@ -2669,6 +2669,21 @@
       </w:pPr>
       <w:r>
         <w:rPr>
+          <w:rtl w:val="0"/>
+        </w:rPr>
+      </w:r>
+    </w:p>
+    <w:p>
+      <w:pPr>
+        <w:spacing w:after="217" w:before="57" w:line="202" w:lineRule="auto"/>
+        <w:ind w:left="0" w:right="0" w:firstLine="0"/>
+        <w:jc w:val="left"/>
+        <w:rPr>
+          <w:rFonts w:ascii="Courier New" w:cs="Courier New" w:eastAsia="Courier New" w:hAnsi="Courier New"/>
+        </w:rPr>
+      </w:pPr>
+      <w:r>
+        <w:rPr>
           <w:rFonts w:ascii="Courier New" w:cs="Courier New" w:eastAsia="Courier New" w:hAnsi="Courier New"/>
           <w:rtl w:val="0"/>
         </w:rPr>
@@ -2704,24 +2719,222 @@
           <w:rFonts w:ascii="Courier New" w:cs="Courier New" w:eastAsia="Courier New" w:hAnsi="Courier New"/>
           <w:rtl w:val="0"/>
         </w:rPr>
-        <w:t xml:space="preserve">    public static void showDialogs(Stage owner, Consumer&lt;String&gt; callback) {</w:t>
-      </w:r>
-    </w:p>
-    <w:p>
-      <w:pPr>
-        <w:spacing w:after="217" w:before="57" w:line="202" w:lineRule="auto"/>
-        <w:ind w:left="0" w:right="0" w:firstLine="0"/>
-        <w:jc w:val="left"/>
-        <w:rPr>
-          <w:rFonts w:ascii="Courier New" w:cs="Courier New" w:eastAsia="Courier New" w:hAnsi="Courier New"/>
-        </w:rPr>
-      </w:pPr>
-      <w:r>
-        <w:rPr>
-          <w:rFonts w:ascii="Courier New" w:cs="Courier New" w:eastAsia="Courier New" w:hAnsi="Courier New"/>
-          <w:rtl w:val="0"/>
-        </w:rPr>
-        <w:t xml:space="preserve">        showFirstDialog(owner, callback);</w:t>
+        <w:t xml:space="preserve">    public static void showDialog(Stage owner, Runnable onNext) {</w:t>
+      </w:r>
+    </w:p>
+    <w:p>
+      <w:pPr>
+        <w:spacing w:after="217" w:before="57" w:line="202" w:lineRule="auto"/>
+        <w:ind w:left="0" w:right="0" w:firstLine="0"/>
+        <w:jc w:val="left"/>
+        <w:rPr>
+          <w:rFonts w:ascii="Courier New" w:cs="Courier New" w:eastAsia="Courier New" w:hAnsi="Courier New"/>
+        </w:rPr>
+      </w:pPr>
+      <w:r>
+        <w:rPr>
+          <w:rFonts w:ascii="Courier New" w:cs="Courier New" w:eastAsia="Courier New" w:hAnsi="Courier New"/>
+          <w:rtl w:val="0"/>
+        </w:rPr>
+        <w:t xml:space="preserve">        Stage stage = Utils.createDialog(owner, "Dialog 1");</w:t>
+      </w:r>
+    </w:p>
+    <w:p>
+      <w:pPr>
+        <w:spacing w:after="217" w:before="57" w:line="202" w:lineRule="auto"/>
+        <w:ind w:left="0" w:right="0" w:firstLine="0"/>
+        <w:jc w:val="left"/>
+        <w:rPr>
+          <w:rFonts w:ascii="Courier New" w:cs="Courier New" w:eastAsia="Courier New" w:hAnsi="Courier New"/>
+        </w:rPr>
+      </w:pPr>
+      <w:r>
+        <w:rPr>
+          <w:rtl w:val="0"/>
+        </w:rPr>
+      </w:r>
+    </w:p>
+    <w:p>
+      <w:pPr>
+        <w:spacing w:after="217" w:before="57" w:line="202" w:lineRule="auto"/>
+        <w:ind w:left="0" w:right="0" w:firstLine="0"/>
+        <w:jc w:val="left"/>
+        <w:rPr>
+          <w:rFonts w:ascii="Courier New" w:cs="Courier New" w:eastAsia="Courier New" w:hAnsi="Courier New"/>
+        </w:rPr>
+      </w:pPr>
+      <w:r>
+        <w:rPr>
+          <w:rFonts w:ascii="Courier New" w:cs="Courier New" w:eastAsia="Courier New" w:hAnsi="Courier New"/>
+          <w:rtl w:val="0"/>
+        </w:rPr>
+        <w:t xml:space="preserve">        Label label = new Label("First dialog window");</w:t>
+      </w:r>
+    </w:p>
+    <w:p>
+      <w:pPr>
+        <w:spacing w:after="217" w:before="57" w:line="202" w:lineRule="auto"/>
+        <w:ind w:left="0" w:right="0" w:firstLine="0"/>
+        <w:jc w:val="left"/>
+        <w:rPr>
+          <w:rFonts w:ascii="Courier New" w:cs="Courier New" w:eastAsia="Courier New" w:hAnsi="Courier New"/>
+        </w:rPr>
+      </w:pPr>
+      <w:r>
+        <w:rPr>
+          <w:rFonts w:ascii="Courier New" w:cs="Courier New" w:eastAsia="Courier New" w:hAnsi="Courier New"/>
+          <w:rtl w:val="0"/>
+        </w:rPr>
+        <w:t xml:space="preserve">        Button btnNext = new Button("Next &gt;");</w:t>
+      </w:r>
+    </w:p>
+    <w:p>
+      <w:pPr>
+        <w:spacing w:after="217" w:before="57" w:line="202" w:lineRule="auto"/>
+        <w:ind w:left="0" w:right="0" w:firstLine="0"/>
+        <w:jc w:val="left"/>
+        <w:rPr>
+          <w:rFonts w:ascii="Courier New" w:cs="Courier New" w:eastAsia="Courier New" w:hAnsi="Courier New"/>
+        </w:rPr>
+      </w:pPr>
+      <w:r>
+        <w:rPr>
+          <w:rFonts w:ascii="Courier New" w:cs="Courier New" w:eastAsia="Courier New" w:hAnsi="Courier New"/>
+          <w:rtl w:val="0"/>
+        </w:rPr>
+        <w:t xml:space="preserve">        Button btnCancel = new Button("Cancel");</w:t>
+      </w:r>
+    </w:p>
+    <w:p>
+      <w:pPr>
+        <w:spacing w:after="217" w:before="57" w:line="202" w:lineRule="auto"/>
+        <w:ind w:left="0" w:right="0" w:firstLine="0"/>
+        <w:jc w:val="left"/>
+        <w:rPr>
+          <w:rFonts w:ascii="Courier New" w:cs="Courier New" w:eastAsia="Courier New" w:hAnsi="Courier New"/>
+        </w:rPr>
+      </w:pPr>
+      <w:r>
+        <w:rPr>
+          <w:rtl w:val="0"/>
+        </w:rPr>
+      </w:r>
+    </w:p>
+    <w:p>
+      <w:pPr>
+        <w:spacing w:after="217" w:before="57" w:line="202" w:lineRule="auto"/>
+        <w:ind w:left="0" w:right="0" w:firstLine="0"/>
+        <w:jc w:val="left"/>
+        <w:rPr>
+          <w:rFonts w:ascii="Courier New" w:cs="Courier New" w:eastAsia="Courier New" w:hAnsi="Courier New"/>
+        </w:rPr>
+      </w:pPr>
+      <w:r>
+        <w:rPr>
+          <w:rFonts w:ascii="Courier New" w:cs="Courier New" w:eastAsia="Courier New" w:hAnsi="Courier New"/>
+          <w:rtl w:val="0"/>
+        </w:rPr>
+        <w:t xml:space="preserve">        btnNext.setOnAction(e -&gt; {</w:t>
+      </w:r>
+    </w:p>
+    <w:p>
+      <w:pPr>
+        <w:spacing w:after="217" w:before="57" w:line="202" w:lineRule="auto"/>
+        <w:ind w:left="0" w:right="0" w:firstLine="0"/>
+        <w:jc w:val="left"/>
+        <w:rPr>
+          <w:rFonts w:ascii="Courier New" w:cs="Courier New" w:eastAsia="Courier New" w:hAnsi="Courier New"/>
+        </w:rPr>
+      </w:pPr>
+      <w:r>
+        <w:rPr>
+          <w:rFonts w:ascii="Courier New" w:cs="Courier New" w:eastAsia="Courier New" w:hAnsi="Courier New"/>
+          <w:rtl w:val="0"/>
+        </w:rPr>
+        <w:t xml:space="preserve">            stage.close();</w:t>
+      </w:r>
+    </w:p>
+    <w:p>
+      <w:pPr>
+        <w:spacing w:after="217" w:before="57" w:line="202" w:lineRule="auto"/>
+        <w:ind w:left="0" w:right="0" w:firstLine="0"/>
+        <w:jc w:val="left"/>
+        <w:rPr>
+          <w:rFonts w:ascii="Courier New" w:cs="Courier New" w:eastAsia="Courier New" w:hAnsi="Courier New"/>
+        </w:rPr>
+      </w:pPr>
+      <w:r>
+        <w:rPr>
+          <w:rFonts w:ascii="Courier New" w:cs="Courier New" w:eastAsia="Courier New" w:hAnsi="Courier New"/>
+          <w:rtl w:val="0"/>
+        </w:rPr>
+        <w:t xml:space="preserve">            onNext.run();</w:t>
+      </w:r>
+    </w:p>
+    <w:p>
+      <w:pPr>
+        <w:spacing w:after="217" w:before="57" w:line="202" w:lineRule="auto"/>
+        <w:ind w:left="0" w:right="0" w:firstLine="0"/>
+        <w:jc w:val="left"/>
+        <w:rPr>
+          <w:rFonts w:ascii="Courier New" w:cs="Courier New" w:eastAsia="Courier New" w:hAnsi="Courier New"/>
+        </w:rPr>
+      </w:pPr>
+      <w:r>
+        <w:rPr>
+          <w:rFonts w:ascii="Courier New" w:cs="Courier New" w:eastAsia="Courier New" w:hAnsi="Courier New"/>
+          <w:rtl w:val="0"/>
+        </w:rPr>
+        <w:t xml:space="preserve">        });</w:t>
+      </w:r>
+    </w:p>
+    <w:p>
+      <w:pPr>
+        <w:spacing w:after="217" w:before="57" w:line="202" w:lineRule="auto"/>
+        <w:ind w:left="0" w:right="0" w:firstLine="0"/>
+        <w:jc w:val="left"/>
+        <w:rPr>
+          <w:rFonts w:ascii="Courier New" w:cs="Courier New" w:eastAsia="Courier New" w:hAnsi="Courier New"/>
+        </w:rPr>
+      </w:pPr>
+      <w:r>
+        <w:rPr>
+          <w:rFonts w:ascii="Courier New" w:cs="Courier New" w:eastAsia="Courier New" w:hAnsi="Courier New"/>
+          <w:rtl w:val="0"/>
+        </w:rPr>
+        <w:t xml:space="preserve">        btnCancel.setOnAction(e -&gt; stage.close());</w:t>
+      </w:r>
+    </w:p>
+    <w:p>
+      <w:pPr>
+        <w:spacing w:after="217" w:before="57" w:line="202" w:lineRule="auto"/>
+        <w:ind w:left="0" w:right="0" w:firstLine="0"/>
+        <w:jc w:val="left"/>
+        <w:rPr>
+          <w:rFonts w:ascii="Courier New" w:cs="Courier New" w:eastAsia="Courier New" w:hAnsi="Courier New"/>
+        </w:rPr>
+      </w:pPr>
+      <w:r>
+        <w:rPr>
+          <w:rtl w:val="0"/>
+        </w:rPr>
+      </w:r>
+    </w:p>
+    <w:p>
+      <w:pPr>
+        <w:spacing w:after="217" w:before="57" w:line="202" w:lineRule="auto"/>
+        <w:ind w:left="0" w:right="0" w:firstLine="0"/>
+        <w:jc w:val="left"/>
+        <w:rPr>
+          <w:rFonts w:ascii="Courier New" w:cs="Courier New" w:eastAsia="Courier New" w:hAnsi="Courier New"/>
+        </w:rPr>
+      </w:pPr>
+      <w:r>
+        <w:rPr>
+          <w:rFonts w:ascii="Courier New" w:cs="Courier New" w:eastAsia="Courier New" w:hAnsi="Courier New"/>
+          <w:rtl w:val="0"/>
+        </w:rPr>
+        <w:t xml:space="preserve">        Utils.showDialog(stage, Utils.dialogRoot(label, Utils.buttonRow(btnNext, btnCancel)), 280, 150);</w:t>
       </w:r>
     </w:p>
     <w:p>
@@ -2752,652 +2965,20 @@
       </w:pPr>
       <w:r>
         <w:rPr>
-          <w:rtl w:val="0"/>
-        </w:rPr>
-      </w:r>
-    </w:p>
-    <w:p>
-      <w:pPr>
-        <w:spacing w:after="217" w:before="57" w:line="202" w:lineRule="auto"/>
-        <w:ind w:left="0" w:right="0" w:firstLine="0"/>
-        <w:jc w:val="left"/>
-        <w:rPr>
-          <w:rFonts w:ascii="Courier New" w:cs="Courier New" w:eastAsia="Courier New" w:hAnsi="Courier New"/>
-        </w:rPr>
-      </w:pPr>
-      <w:r>
-        <w:rPr>
-          <w:rFonts w:ascii="Courier New" w:cs="Courier New" w:eastAsia="Courier New" w:hAnsi="Courier New"/>
-          <w:rtl w:val="0"/>
-        </w:rPr>
-        <w:t xml:space="preserve">    private static void showFirstDialog(Stage owner, Consumer&lt;String&gt; callback) {</w:t>
-      </w:r>
-    </w:p>
-    <w:p>
-      <w:pPr>
-        <w:spacing w:after="217" w:before="57" w:line="202" w:lineRule="auto"/>
-        <w:ind w:left="0" w:right="0" w:firstLine="0"/>
-        <w:jc w:val="left"/>
-        <w:rPr>
-          <w:rFonts w:ascii="Courier New" w:cs="Courier New" w:eastAsia="Courier New" w:hAnsi="Courier New"/>
-        </w:rPr>
-      </w:pPr>
-      <w:r>
-        <w:rPr>
-          <w:rFonts w:ascii="Courier New" w:cs="Courier New" w:eastAsia="Courier New" w:hAnsi="Courier New"/>
-          <w:rtl w:val="0"/>
-        </w:rPr>
-        <w:t xml:space="preserve">        Stage stage = Utils.createDialog(owner, "Dialog 1");</w:t>
-      </w:r>
-    </w:p>
-    <w:p>
-      <w:pPr>
-        <w:spacing w:after="217" w:before="57" w:line="202" w:lineRule="auto"/>
-        <w:ind w:left="0" w:right="0" w:firstLine="0"/>
-        <w:jc w:val="left"/>
-        <w:rPr>
-          <w:rFonts w:ascii="Courier New" w:cs="Courier New" w:eastAsia="Courier New" w:hAnsi="Courier New"/>
-        </w:rPr>
-      </w:pPr>
-      <w:r>
-        <w:rPr>
-          <w:rtl w:val="0"/>
-        </w:rPr>
-      </w:r>
-    </w:p>
-    <w:p>
-      <w:pPr>
-        <w:spacing w:after="217" w:before="57" w:line="202" w:lineRule="auto"/>
-        <w:ind w:left="0" w:right="0" w:firstLine="0"/>
-        <w:jc w:val="left"/>
-        <w:rPr>
-          <w:rFonts w:ascii="Courier New" w:cs="Courier New" w:eastAsia="Courier New" w:hAnsi="Courier New"/>
-        </w:rPr>
-      </w:pPr>
-      <w:r>
-        <w:rPr>
-          <w:rFonts w:ascii="Courier New" w:cs="Courier New" w:eastAsia="Courier New" w:hAnsi="Courier New"/>
-          <w:rtl w:val="0"/>
-        </w:rPr>
-        <w:t xml:space="preserve">        Label label = new Label("First dialog window");</w:t>
-      </w:r>
-    </w:p>
-    <w:p>
-      <w:pPr>
-        <w:spacing w:after="217" w:before="57" w:line="202" w:lineRule="auto"/>
-        <w:ind w:left="0" w:right="0" w:firstLine="0"/>
-        <w:jc w:val="left"/>
-        <w:rPr>
-          <w:rFonts w:ascii="Courier New" w:cs="Courier New" w:eastAsia="Courier New" w:hAnsi="Courier New"/>
-        </w:rPr>
-      </w:pPr>
-      <w:r>
-        <w:rPr>
-          <w:rFonts w:ascii="Courier New" w:cs="Courier New" w:eastAsia="Courier New" w:hAnsi="Courier New"/>
-          <w:rtl w:val="0"/>
-        </w:rPr>
-        <w:t xml:space="preserve">        Button btnNext = new Button("Next &gt;");</w:t>
-      </w:r>
-    </w:p>
-    <w:p>
-      <w:pPr>
-        <w:spacing w:after="217" w:before="57" w:line="202" w:lineRule="auto"/>
-        <w:ind w:left="0" w:right="0" w:firstLine="0"/>
-        <w:jc w:val="left"/>
-        <w:rPr>
-          <w:rFonts w:ascii="Courier New" w:cs="Courier New" w:eastAsia="Courier New" w:hAnsi="Courier New"/>
-        </w:rPr>
-      </w:pPr>
-      <w:r>
-        <w:rPr>
-          <w:rFonts w:ascii="Courier New" w:cs="Courier New" w:eastAsia="Courier New" w:hAnsi="Courier New"/>
-          <w:rtl w:val="0"/>
-        </w:rPr>
-        <w:t xml:space="preserve">        Button btnCancel = new Button("Cancel");</w:t>
-      </w:r>
-    </w:p>
-    <w:p>
-      <w:pPr>
-        <w:spacing w:after="217" w:before="57" w:line="202" w:lineRule="auto"/>
-        <w:ind w:left="0" w:right="0" w:firstLine="0"/>
-        <w:jc w:val="left"/>
-        <w:rPr>
-          <w:rFonts w:ascii="Courier New" w:cs="Courier New" w:eastAsia="Courier New" w:hAnsi="Courier New"/>
-        </w:rPr>
-      </w:pPr>
-      <w:r>
-        <w:rPr>
-          <w:rtl w:val="0"/>
-        </w:rPr>
-      </w:r>
-    </w:p>
-    <w:p>
-      <w:pPr>
-        <w:spacing w:after="217" w:before="57" w:line="202" w:lineRule="auto"/>
-        <w:ind w:left="0" w:right="0" w:firstLine="0"/>
-        <w:jc w:val="left"/>
-        <w:rPr>
-          <w:rFonts w:ascii="Courier New" w:cs="Courier New" w:eastAsia="Courier New" w:hAnsi="Courier New"/>
-        </w:rPr>
-      </w:pPr>
-      <w:r>
-        <w:rPr>
-          <w:rFonts w:ascii="Courier New" w:cs="Courier New" w:eastAsia="Courier New" w:hAnsi="Courier New"/>
-          <w:rtl w:val="0"/>
-        </w:rPr>
-        <w:t xml:space="preserve">        btnNext.setOnAction(e -&gt; {</w:t>
-      </w:r>
-    </w:p>
-    <w:p>
-      <w:pPr>
-        <w:spacing w:after="217" w:before="57" w:line="202" w:lineRule="auto"/>
-        <w:ind w:left="0" w:right="0" w:firstLine="0"/>
-        <w:jc w:val="left"/>
-        <w:rPr>
-          <w:rFonts w:ascii="Courier New" w:cs="Courier New" w:eastAsia="Courier New" w:hAnsi="Courier New"/>
-        </w:rPr>
-      </w:pPr>
-      <w:r>
-        <w:rPr>
-          <w:rFonts w:ascii="Courier New" w:cs="Courier New" w:eastAsia="Courier New" w:hAnsi="Courier New"/>
-          <w:rtl w:val="0"/>
-        </w:rPr>
-        <w:t xml:space="preserve">            stage.close();</w:t>
-      </w:r>
-    </w:p>
-    <w:p>
-      <w:pPr>
-        <w:spacing w:after="217" w:before="57" w:line="202" w:lineRule="auto"/>
-        <w:ind w:left="0" w:right="0" w:firstLine="0"/>
-        <w:jc w:val="left"/>
-        <w:rPr>
-          <w:rFonts w:ascii="Courier New" w:cs="Courier New" w:eastAsia="Courier New" w:hAnsi="Courier New"/>
-        </w:rPr>
-      </w:pPr>
-      <w:r>
-        <w:rPr>
-          <w:rFonts w:ascii="Courier New" w:cs="Courier New" w:eastAsia="Courier New" w:hAnsi="Courier New"/>
-          <w:rtl w:val="0"/>
-        </w:rPr>
-        <w:t xml:space="preserve">            showSecondDialog(owner, callback);</w:t>
-      </w:r>
-    </w:p>
-    <w:p>
-      <w:pPr>
-        <w:spacing w:after="217" w:before="57" w:line="202" w:lineRule="auto"/>
-        <w:ind w:left="0" w:right="0" w:firstLine="0"/>
-        <w:jc w:val="left"/>
-        <w:rPr>
-          <w:rFonts w:ascii="Courier New" w:cs="Courier New" w:eastAsia="Courier New" w:hAnsi="Courier New"/>
-        </w:rPr>
-      </w:pPr>
-      <w:r>
-        <w:rPr>
-          <w:rFonts w:ascii="Courier New" w:cs="Courier New" w:eastAsia="Courier New" w:hAnsi="Courier New"/>
-          <w:rtl w:val="0"/>
-        </w:rPr>
-        <w:t xml:space="preserve">        });</w:t>
-      </w:r>
-    </w:p>
-    <w:p>
-      <w:pPr>
-        <w:spacing w:after="217" w:before="57" w:line="202" w:lineRule="auto"/>
-        <w:ind w:left="0" w:right="0" w:firstLine="0"/>
-        <w:jc w:val="left"/>
-        <w:rPr>
-          <w:rFonts w:ascii="Courier New" w:cs="Courier New" w:eastAsia="Courier New" w:hAnsi="Courier New"/>
-        </w:rPr>
-      </w:pPr>
-      <w:r>
-        <w:rPr>
-          <w:rFonts w:ascii="Courier New" w:cs="Courier New" w:eastAsia="Courier New" w:hAnsi="Courier New"/>
-          <w:rtl w:val="0"/>
-        </w:rPr>
-        <w:t xml:space="preserve">        btnCancel.setOnAction(e -&gt; stage.close());</w:t>
-      </w:r>
-    </w:p>
-    <w:p>
-      <w:pPr>
-        <w:spacing w:after="217" w:before="57" w:line="202" w:lineRule="auto"/>
-        <w:ind w:left="0" w:right="0" w:firstLine="0"/>
-        <w:jc w:val="left"/>
-        <w:rPr>
-          <w:rFonts w:ascii="Courier New" w:cs="Courier New" w:eastAsia="Courier New" w:hAnsi="Courier New"/>
-        </w:rPr>
-      </w:pPr>
-      <w:r>
-        <w:rPr>
-          <w:rtl w:val="0"/>
-        </w:rPr>
-      </w:r>
-    </w:p>
-    <w:p>
-      <w:pPr>
-        <w:spacing w:after="217" w:before="57" w:line="202" w:lineRule="auto"/>
-        <w:ind w:left="0" w:right="0" w:firstLine="0"/>
-        <w:jc w:val="left"/>
-        <w:rPr>
-          <w:rFonts w:ascii="Courier New" w:cs="Courier New" w:eastAsia="Courier New" w:hAnsi="Courier New"/>
-        </w:rPr>
-      </w:pPr>
-      <w:r>
-        <w:rPr>
-          <w:rFonts w:ascii="Courier New" w:cs="Courier New" w:eastAsia="Courier New" w:hAnsi="Courier New"/>
-          <w:rtl w:val="0"/>
-        </w:rPr>
-        <w:t xml:space="preserve">        Utils.showDialog(stage, Utils.dialogRoot(label, Utils.buttonRow(btnNext, btnCancel)), 280, 150);</w:t>
-      </w:r>
-    </w:p>
-    <w:p>
-      <w:pPr>
-        <w:spacing w:after="217" w:before="57" w:line="202" w:lineRule="auto"/>
-        <w:ind w:left="0" w:right="0" w:firstLine="0"/>
-        <w:jc w:val="left"/>
-        <w:rPr>
-          <w:rFonts w:ascii="Courier New" w:cs="Courier New" w:eastAsia="Courier New" w:hAnsi="Courier New"/>
-        </w:rPr>
-      </w:pPr>
-      <w:r>
-        <w:rPr>
-          <w:rFonts w:ascii="Courier New" w:cs="Courier New" w:eastAsia="Courier New" w:hAnsi="Courier New"/>
-          <w:rtl w:val="0"/>
-        </w:rPr>
-        <w:t xml:space="preserve">    }</w:t>
-      </w:r>
-    </w:p>
-    <w:p>
-      <w:pPr>
-        <w:spacing w:after="217" w:before="57" w:line="202" w:lineRule="auto"/>
-        <w:ind w:left="0" w:right="0" w:firstLine="0"/>
-        <w:jc w:val="left"/>
-        <w:rPr>
-          <w:rFonts w:ascii="Courier New" w:cs="Courier New" w:eastAsia="Courier New" w:hAnsi="Courier New"/>
-        </w:rPr>
-      </w:pPr>
-      <w:r>
-        <w:rPr>
-          <w:rtl w:val="0"/>
-        </w:rPr>
-      </w:r>
-    </w:p>
-    <w:p>
-      <w:pPr>
-        <w:spacing w:after="217" w:before="57" w:line="202" w:lineRule="auto"/>
-        <w:ind w:left="0" w:right="0" w:firstLine="0"/>
-        <w:jc w:val="left"/>
-        <w:rPr>
-          <w:rFonts w:ascii="Courier New" w:cs="Courier New" w:eastAsia="Courier New" w:hAnsi="Courier New"/>
-        </w:rPr>
-      </w:pPr>
-      <w:r>
-        <w:rPr>
-          <w:rFonts w:ascii="Courier New" w:cs="Courier New" w:eastAsia="Courier New" w:hAnsi="Courier New"/>
-          <w:rtl w:val="0"/>
-        </w:rPr>
-        <w:t xml:space="preserve">    private static void showSecondDialog(Stage owner, Consumer&lt;String&gt; callback) {</w:t>
-      </w:r>
-    </w:p>
-    <w:p>
-      <w:pPr>
-        <w:spacing w:after="217" w:before="57" w:line="202" w:lineRule="auto"/>
-        <w:ind w:left="0" w:right="0" w:firstLine="0"/>
-        <w:jc w:val="left"/>
-        <w:rPr>
-          <w:rFonts w:ascii="Courier New" w:cs="Courier New" w:eastAsia="Courier New" w:hAnsi="Courier New"/>
-        </w:rPr>
-      </w:pPr>
-      <w:r>
-        <w:rPr>
-          <w:rFonts w:ascii="Courier New" w:cs="Courier New" w:eastAsia="Courier New" w:hAnsi="Courier New"/>
-          <w:rtl w:val="0"/>
-        </w:rPr>
-        <w:t xml:space="preserve">        Stage stage = Utils.createDialog(owner, "Dialog 2");</w:t>
-      </w:r>
-    </w:p>
-    <w:p>
-      <w:pPr>
-        <w:spacing w:after="217" w:before="57" w:line="202" w:lineRule="auto"/>
-        <w:ind w:left="0" w:right="0" w:firstLine="0"/>
-        <w:jc w:val="left"/>
-        <w:rPr>
-          <w:rFonts w:ascii="Courier New" w:cs="Courier New" w:eastAsia="Courier New" w:hAnsi="Courier New"/>
-        </w:rPr>
-      </w:pPr>
-      <w:r>
-        <w:rPr>
-          <w:rtl w:val="0"/>
-        </w:rPr>
-      </w:r>
-    </w:p>
-    <w:p>
-      <w:pPr>
-        <w:spacing w:after="217" w:before="57" w:line="202" w:lineRule="auto"/>
-        <w:ind w:left="0" w:right="0" w:firstLine="0"/>
-        <w:jc w:val="left"/>
-        <w:rPr>
-          <w:rFonts w:ascii="Courier New" w:cs="Courier New" w:eastAsia="Courier New" w:hAnsi="Courier New"/>
-        </w:rPr>
-      </w:pPr>
-      <w:r>
-        <w:rPr>
-          <w:rFonts w:ascii="Courier New" w:cs="Courier New" w:eastAsia="Courier New" w:hAnsi="Courier New"/>
-          <w:rtl w:val="0"/>
-        </w:rPr>
-        <w:t xml:space="preserve">        Label label = new Label("Second dialog window");</w:t>
-      </w:r>
-    </w:p>
-    <w:p>
-      <w:pPr>
-        <w:spacing w:after="217" w:before="57" w:line="202" w:lineRule="auto"/>
-        <w:ind w:left="0" w:right="0" w:firstLine="0"/>
-        <w:jc w:val="left"/>
-        <w:rPr>
-          <w:rFonts w:ascii="Courier New" w:cs="Courier New" w:eastAsia="Courier New" w:hAnsi="Courier New"/>
-        </w:rPr>
-      </w:pPr>
-      <w:r>
-        <w:rPr>
-          <w:rFonts w:ascii="Courier New" w:cs="Courier New" w:eastAsia="Courier New" w:hAnsi="Courier New"/>
-          <w:rtl w:val="0"/>
-        </w:rPr>
-        <w:t xml:space="preserve">        Button btnBack = new Button("&lt; Back");</w:t>
-      </w:r>
-    </w:p>
-    <w:p>
-      <w:pPr>
-        <w:spacing w:after="217" w:before="57" w:line="202" w:lineRule="auto"/>
-        <w:ind w:left="0" w:right="0" w:firstLine="0"/>
-        <w:jc w:val="left"/>
-        <w:rPr>
-          <w:rFonts w:ascii="Courier New" w:cs="Courier New" w:eastAsia="Courier New" w:hAnsi="Courier New"/>
-        </w:rPr>
-      </w:pPr>
-      <w:r>
-        <w:rPr>
-          <w:rFonts w:ascii="Courier New" w:cs="Courier New" w:eastAsia="Courier New" w:hAnsi="Courier New"/>
-          <w:rtl w:val="0"/>
-        </w:rPr>
-        <w:t xml:space="preserve">        Button btnYes = new Button("Yes");</w:t>
-      </w:r>
-    </w:p>
-    <w:p>
-      <w:pPr>
-        <w:spacing w:after="217" w:before="57" w:line="202" w:lineRule="auto"/>
-        <w:ind w:left="0" w:right="0" w:firstLine="0"/>
-        <w:jc w:val="left"/>
-        <w:rPr>
-          <w:rFonts w:ascii="Courier New" w:cs="Courier New" w:eastAsia="Courier New" w:hAnsi="Courier New"/>
-        </w:rPr>
-      </w:pPr>
-      <w:r>
-        <w:rPr>
-          <w:rFonts w:ascii="Courier New" w:cs="Courier New" w:eastAsia="Courier New" w:hAnsi="Courier New"/>
-          <w:rtl w:val="0"/>
-        </w:rPr>
-        <w:t xml:space="preserve">        Button btnCancel = new Button("Cancel");</w:t>
-      </w:r>
-    </w:p>
-    <w:p>
-      <w:pPr>
-        <w:spacing w:after="217" w:before="57" w:line="202" w:lineRule="auto"/>
-        <w:ind w:left="0" w:right="0" w:firstLine="0"/>
-        <w:jc w:val="left"/>
-        <w:rPr>
-          <w:rFonts w:ascii="Courier New" w:cs="Courier New" w:eastAsia="Courier New" w:hAnsi="Courier New"/>
-        </w:rPr>
-      </w:pPr>
-      <w:r>
-        <w:rPr>
-          <w:rtl w:val="0"/>
-        </w:rPr>
-      </w:r>
-    </w:p>
-    <w:p>
-      <w:pPr>
-        <w:spacing w:after="217" w:before="57" w:line="202" w:lineRule="auto"/>
-        <w:ind w:left="0" w:right="0" w:firstLine="0"/>
-        <w:jc w:val="left"/>
-        <w:rPr>
-          <w:rFonts w:ascii="Courier New" w:cs="Courier New" w:eastAsia="Courier New" w:hAnsi="Courier New"/>
-        </w:rPr>
-      </w:pPr>
-      <w:r>
-        <w:rPr>
-          <w:rFonts w:ascii="Courier New" w:cs="Courier New" w:eastAsia="Courier New" w:hAnsi="Courier New"/>
-          <w:rtl w:val="0"/>
-        </w:rPr>
-        <w:t xml:space="preserve">        btnBack.setOnAction(e -&gt; {</w:t>
-      </w:r>
-    </w:p>
-    <w:p>
-      <w:pPr>
-        <w:spacing w:after="217" w:before="57" w:line="202" w:lineRule="auto"/>
-        <w:ind w:left="0" w:right="0" w:firstLine="0"/>
-        <w:jc w:val="left"/>
-        <w:rPr>
-          <w:rFonts w:ascii="Courier New" w:cs="Courier New" w:eastAsia="Courier New" w:hAnsi="Courier New"/>
-        </w:rPr>
-      </w:pPr>
-      <w:r>
-        <w:rPr>
-          <w:rFonts w:ascii="Courier New" w:cs="Courier New" w:eastAsia="Courier New" w:hAnsi="Courier New"/>
-          <w:rtl w:val="0"/>
-        </w:rPr>
-        <w:t xml:space="preserve">            stage.close();</w:t>
-      </w:r>
-    </w:p>
-    <w:p>
-      <w:pPr>
-        <w:spacing w:after="217" w:before="57" w:line="202" w:lineRule="auto"/>
-        <w:ind w:left="0" w:right="0" w:firstLine="0"/>
-        <w:jc w:val="left"/>
-        <w:rPr>
-          <w:rFonts w:ascii="Courier New" w:cs="Courier New" w:eastAsia="Courier New" w:hAnsi="Courier New"/>
-        </w:rPr>
-      </w:pPr>
-      <w:r>
-        <w:rPr>
-          <w:rFonts w:ascii="Courier New" w:cs="Courier New" w:eastAsia="Courier New" w:hAnsi="Courier New"/>
-          <w:rtl w:val="0"/>
-        </w:rPr>
-        <w:t xml:space="preserve">            showFirstDialog(owner, callback);</w:t>
-      </w:r>
-    </w:p>
-    <w:p>
-      <w:pPr>
-        <w:spacing w:after="217" w:before="57" w:line="202" w:lineRule="auto"/>
-        <w:ind w:left="0" w:right="0" w:firstLine="0"/>
-        <w:jc w:val="left"/>
-        <w:rPr>
-          <w:rFonts w:ascii="Courier New" w:cs="Courier New" w:eastAsia="Courier New" w:hAnsi="Courier New"/>
-        </w:rPr>
-      </w:pPr>
-      <w:r>
-        <w:rPr>
-          <w:rFonts w:ascii="Courier New" w:cs="Courier New" w:eastAsia="Courier New" w:hAnsi="Courier New"/>
-          <w:rtl w:val="0"/>
-        </w:rPr>
-        <w:t xml:space="preserve">        });</w:t>
-      </w:r>
-    </w:p>
-    <w:p>
-      <w:pPr>
-        <w:spacing w:after="217" w:before="57" w:line="202" w:lineRule="auto"/>
-        <w:ind w:left="0" w:right="0" w:firstLine="0"/>
-        <w:jc w:val="left"/>
-        <w:rPr>
-          <w:rFonts w:ascii="Courier New" w:cs="Courier New" w:eastAsia="Courier New" w:hAnsi="Courier New"/>
-        </w:rPr>
-      </w:pPr>
-      <w:r>
-        <w:rPr>
-          <w:rFonts w:ascii="Courier New" w:cs="Courier New" w:eastAsia="Courier New" w:hAnsi="Courier New"/>
-          <w:rtl w:val="0"/>
-        </w:rPr>
-        <w:t xml:space="preserve">        btnYes.setOnAction(e -&gt; {</w:t>
-      </w:r>
-    </w:p>
-    <w:p>
-      <w:pPr>
-        <w:spacing w:after="217" w:before="57" w:line="202" w:lineRule="auto"/>
-        <w:ind w:left="0" w:right="0" w:firstLine="0"/>
-        <w:jc w:val="left"/>
-        <w:rPr>
-          <w:rFonts w:ascii="Courier New" w:cs="Courier New" w:eastAsia="Courier New" w:hAnsi="Courier New"/>
-        </w:rPr>
-      </w:pPr>
-      <w:r>
-        <w:rPr>
-          <w:rFonts w:ascii="Courier New" w:cs="Courier New" w:eastAsia="Courier New" w:hAnsi="Courier New"/>
-          <w:rtl w:val="0"/>
-        </w:rPr>
-        <w:t xml:space="preserve">            callback.accept("Both dialog windows completed successfully!");</w:t>
-      </w:r>
-    </w:p>
-    <w:p>
-      <w:pPr>
-        <w:spacing w:after="217" w:before="57" w:line="202" w:lineRule="auto"/>
-        <w:ind w:left="0" w:right="0" w:firstLine="0"/>
-        <w:jc w:val="left"/>
-        <w:rPr>
-          <w:rFonts w:ascii="Courier New" w:cs="Courier New" w:eastAsia="Courier New" w:hAnsi="Courier New"/>
-        </w:rPr>
-      </w:pPr>
-      <w:r>
-        <w:rPr>
-          <w:rFonts w:ascii="Courier New" w:cs="Courier New" w:eastAsia="Courier New" w:hAnsi="Courier New"/>
-          <w:rtl w:val="0"/>
-        </w:rPr>
-        <w:t xml:space="preserve">            stage.close();</w:t>
-      </w:r>
-    </w:p>
-    <w:p>
-      <w:pPr>
-        <w:spacing w:after="217" w:before="57" w:line="202" w:lineRule="auto"/>
-        <w:ind w:left="0" w:right="0" w:firstLine="0"/>
-        <w:jc w:val="left"/>
-        <w:rPr>
-          <w:rFonts w:ascii="Courier New" w:cs="Courier New" w:eastAsia="Courier New" w:hAnsi="Courier New"/>
-        </w:rPr>
-      </w:pPr>
-      <w:r>
-        <w:rPr>
-          <w:rFonts w:ascii="Courier New" w:cs="Courier New" w:eastAsia="Courier New" w:hAnsi="Courier New"/>
-          <w:rtl w:val="0"/>
-        </w:rPr>
-        <w:t xml:space="preserve">        });</w:t>
-      </w:r>
-    </w:p>
-    <w:p>
-      <w:pPr>
-        <w:spacing w:after="217" w:before="57" w:line="202" w:lineRule="auto"/>
-        <w:ind w:left="0" w:right="0" w:firstLine="0"/>
-        <w:jc w:val="left"/>
-        <w:rPr>
-          <w:rFonts w:ascii="Courier New" w:cs="Courier New" w:eastAsia="Courier New" w:hAnsi="Courier New"/>
-        </w:rPr>
-      </w:pPr>
-      <w:r>
-        <w:rPr>
-          <w:rFonts w:ascii="Courier New" w:cs="Courier New" w:eastAsia="Courier New" w:hAnsi="Courier New"/>
-          <w:rtl w:val="0"/>
-        </w:rPr>
-        <w:t xml:space="preserve">        btnCancel.setOnAction(e -&gt; stage.close());</w:t>
-      </w:r>
-    </w:p>
-    <w:p>
-      <w:pPr>
-        <w:spacing w:after="217" w:before="57" w:line="202" w:lineRule="auto"/>
-        <w:ind w:left="0" w:right="0" w:firstLine="0"/>
-        <w:jc w:val="left"/>
-        <w:rPr>
-          <w:rFonts w:ascii="Courier New" w:cs="Courier New" w:eastAsia="Courier New" w:hAnsi="Courier New"/>
-        </w:rPr>
-      </w:pPr>
-      <w:r>
-        <w:rPr>
-          <w:rtl w:val="0"/>
-        </w:rPr>
-      </w:r>
-    </w:p>
-    <w:p>
-      <w:pPr>
-        <w:spacing w:after="217" w:before="57" w:line="202" w:lineRule="auto"/>
-        <w:ind w:left="0" w:right="0" w:firstLine="0"/>
-        <w:jc w:val="left"/>
-        <w:rPr>
-          <w:rFonts w:ascii="Courier New" w:cs="Courier New" w:eastAsia="Courier New" w:hAnsi="Courier New"/>
-        </w:rPr>
-      </w:pPr>
-      <w:r>
-        <w:rPr>
-          <w:rFonts w:ascii="Courier New" w:cs="Courier New" w:eastAsia="Courier New" w:hAnsi="Courier New"/>
-          <w:rtl w:val="0"/>
-        </w:rPr>
-        <w:t xml:space="preserve">        Utils.showDialog(stage, Utils.dialogRoot(label, Utils.buttonRow(btnBack, btnYes, btnCancel)), 300, 150);</w:t>
-      </w:r>
-    </w:p>
-    <w:p>
-      <w:pPr>
-        <w:spacing w:after="217" w:before="57" w:line="202" w:lineRule="auto"/>
-        <w:ind w:left="0" w:right="0" w:firstLine="0"/>
-        <w:jc w:val="left"/>
-        <w:rPr>
-          <w:rFonts w:ascii="Courier New" w:cs="Courier New" w:eastAsia="Courier New" w:hAnsi="Courier New"/>
-        </w:rPr>
-      </w:pPr>
-      <w:r>
-        <w:rPr>
-          <w:rFonts w:ascii="Courier New" w:cs="Courier New" w:eastAsia="Courier New" w:hAnsi="Courier New"/>
-          <w:rtl w:val="0"/>
-        </w:rPr>
-        <w:t xml:space="preserve">    }</w:t>
-      </w:r>
-    </w:p>
-    <w:p>
-      <w:pPr>
-        <w:spacing w:after="217" w:before="57" w:line="202" w:lineRule="auto"/>
-        <w:ind w:left="0" w:right="0" w:firstLine="0"/>
-        <w:jc w:val="left"/>
-        <w:rPr>
-          <w:rFonts w:ascii="Courier New" w:cs="Courier New" w:eastAsia="Courier New" w:hAnsi="Courier New"/>
-        </w:rPr>
-      </w:pPr>
-      <w:r>
-        <w:rPr>
           <w:rFonts w:ascii="Courier New" w:cs="Courier New" w:eastAsia="Courier New" w:hAnsi="Courier New"/>
           <w:rtl w:val="0"/>
         </w:rPr>
         <w:t xml:space="preserve">}</w:t>
       </w:r>
-      <w:r>
-        <w:rPr>
-          <w:rtl w:val="0"/>
-        </w:rPr>
-      </w:r>
-    </w:p>
-    <w:p>
-      <w:pPr>
-        <w:spacing w:after="217" w:before="57" w:line="202" w:lineRule="auto"/>
-        <w:ind w:left="0" w:right="0" w:firstLine="0"/>
-        <w:jc w:val="left"/>
-        <w:rPr>
-          <w:rFonts w:ascii="Courier New" w:cs="Courier New" w:eastAsia="Courier New" w:hAnsi="Courier New"/>
-          <w:sz w:val="22"/>
-          <w:szCs w:val="22"/>
-        </w:rPr>
-      </w:pPr>
-      <w:r>
-        <w:rPr>
-          <w:rtl w:val="0"/>
-        </w:rPr>
-      </w:r>
-    </w:p>
-    <w:p>
-      <w:pPr>
-        <w:spacing w:after="217" w:before="0" w:line="259" w:lineRule="auto"/>
-        <w:ind w:left="0" w:right="0" w:firstLine="0"/>
-        <w:jc w:val="left"/>
+    </w:p>
+    <w:p>
+      <w:pPr>
+        <w:spacing w:after="217" w:line="259" w:lineRule="auto"/>
+        <w:rPr>
+          <w:rFonts w:ascii="Courier New" w:cs="Courier New" w:eastAsia="Courier New" w:hAnsi="Courier New"/>
+        </w:rPr>
+      </w:pPr>
+      <w:r>
         <w:rPr>
           <w:rFonts w:ascii="Times New Roman" w:cs="Times New Roman" w:eastAsia="Times New Roman" w:hAnsi="Times New Roman"/>
           <w:b w:val="1"/>
@@ -3405,9 +2986,457 @@
           <w:sz w:val="28"/>
           <w:szCs w:val="28"/>
           <w:u w:val="single"/>
-        </w:rPr>
-      </w:pPr>
-      <w:r>
+          <w:rtl w:val="0"/>
+        </w:rPr>
+        <w:t xml:space="preserve">Module3.java</w:t>
+      </w:r>
+      <w:r>
+        <w:rPr>
+          <w:rtl w:val="0"/>
+        </w:rPr>
+      </w:r>
+    </w:p>
+    <w:p>
+      <w:pPr>
+        <w:spacing w:after="217" w:before="57" w:line="202" w:lineRule="auto"/>
+        <w:rPr>
+          <w:rFonts w:ascii="Courier New" w:cs="Courier New" w:eastAsia="Courier New" w:hAnsi="Courier New"/>
+        </w:rPr>
+      </w:pPr>
+      <w:r>
+        <w:rPr>
+          <w:rFonts w:ascii="Courier New" w:cs="Courier New" w:eastAsia="Courier New" w:hAnsi="Courier New"/>
+          <w:rtl w:val="0"/>
+        </w:rPr>
+        <w:t xml:space="preserve">import javafx.scene.control.Button;</w:t>
+      </w:r>
+    </w:p>
+    <w:p>
+      <w:pPr>
+        <w:spacing w:after="217" w:before="57" w:line="202" w:lineRule="auto"/>
+        <w:rPr>
+          <w:rFonts w:ascii="Courier New" w:cs="Courier New" w:eastAsia="Courier New" w:hAnsi="Courier New"/>
+        </w:rPr>
+      </w:pPr>
+      <w:r>
+        <w:rPr>
+          <w:rFonts w:ascii="Courier New" w:cs="Courier New" w:eastAsia="Courier New" w:hAnsi="Courier New"/>
+          <w:rtl w:val="0"/>
+        </w:rPr>
+        <w:t xml:space="preserve">import javafx.scene.control.Label;</w:t>
+      </w:r>
+    </w:p>
+    <w:p>
+      <w:pPr>
+        <w:spacing w:after="217" w:before="57" w:line="202" w:lineRule="auto"/>
+        <w:rPr>
+          <w:rFonts w:ascii="Courier New" w:cs="Courier New" w:eastAsia="Courier New" w:hAnsi="Courier New"/>
+        </w:rPr>
+      </w:pPr>
+      <w:r>
+        <w:rPr>
+          <w:rFonts w:ascii="Courier New" w:cs="Courier New" w:eastAsia="Courier New" w:hAnsi="Courier New"/>
+          <w:rtl w:val="0"/>
+        </w:rPr>
+        <w:t xml:space="preserve">import javafx.stage.Stage;</w:t>
+      </w:r>
+    </w:p>
+    <w:p>
+      <w:pPr>
+        <w:spacing w:after="217" w:before="57" w:line="202" w:lineRule="auto"/>
+        <w:rPr>
+          <w:rFonts w:ascii="Courier New" w:cs="Courier New" w:eastAsia="Courier New" w:hAnsi="Courier New"/>
+        </w:rPr>
+      </w:pPr>
+      <w:r>
+        <w:rPr>
+          <w:rtl w:val="0"/>
+        </w:rPr>
+      </w:r>
+    </w:p>
+    <w:p>
+      <w:pPr>
+        <w:spacing w:after="217" w:before="57" w:line="202" w:lineRule="auto"/>
+        <w:rPr>
+          <w:rFonts w:ascii="Courier New" w:cs="Courier New" w:eastAsia="Courier New" w:hAnsi="Courier New"/>
+        </w:rPr>
+      </w:pPr>
+      <w:r>
+        <w:rPr>
+          <w:rFonts w:ascii="Courier New" w:cs="Courier New" w:eastAsia="Courier New" w:hAnsi="Courier New"/>
+          <w:rtl w:val="0"/>
+        </w:rPr>
+        <w:t xml:space="preserve">import java.util.function.Consumer;</w:t>
+      </w:r>
+    </w:p>
+    <w:p>
+      <w:pPr>
+        <w:spacing w:after="217" w:before="57" w:line="202" w:lineRule="auto"/>
+        <w:rPr>
+          <w:rFonts w:ascii="Courier New" w:cs="Courier New" w:eastAsia="Courier New" w:hAnsi="Courier New"/>
+        </w:rPr>
+      </w:pPr>
+      <w:r>
+        <w:rPr>
+          <w:rtl w:val="0"/>
+        </w:rPr>
+      </w:r>
+    </w:p>
+    <w:p>
+      <w:pPr>
+        <w:spacing w:after="217" w:before="57" w:line="202" w:lineRule="auto"/>
+        <w:rPr>
+          <w:rFonts w:ascii="Courier New" w:cs="Courier New" w:eastAsia="Courier New" w:hAnsi="Courier New"/>
+        </w:rPr>
+      </w:pPr>
+      <w:r>
+        <w:rPr>
+          <w:rFonts w:ascii="Courier New" w:cs="Courier New" w:eastAsia="Courier New" w:hAnsi="Courier New"/>
+          <w:rtl w:val="0"/>
+        </w:rPr>
+        <w:t xml:space="preserve">public class Module3 {</w:t>
+      </w:r>
+    </w:p>
+    <w:p>
+      <w:pPr>
+        <w:spacing w:after="217" w:before="57" w:line="202" w:lineRule="auto"/>
+        <w:rPr>
+          <w:rFonts w:ascii="Courier New" w:cs="Courier New" w:eastAsia="Courier New" w:hAnsi="Courier New"/>
+        </w:rPr>
+      </w:pPr>
+      <w:r>
+        <w:rPr>
+          <w:rtl w:val="0"/>
+        </w:rPr>
+      </w:r>
+    </w:p>
+    <w:p>
+      <w:pPr>
+        <w:spacing w:after="217" w:before="57" w:line="202" w:lineRule="auto"/>
+        <w:rPr>
+          <w:rFonts w:ascii="Courier New" w:cs="Courier New" w:eastAsia="Courier New" w:hAnsi="Courier New"/>
+        </w:rPr>
+      </w:pPr>
+      <w:r>
+        <w:rPr>
+          <w:rFonts w:ascii="Courier New" w:cs="Courier New" w:eastAsia="Courier New" w:hAnsi="Courier New"/>
+          <w:rtl w:val="0"/>
+        </w:rPr>
+        <w:t xml:space="preserve">    public static void showDialog(Stage owner, Runnable onBack, Consumer&lt;String&gt; callback) {</w:t>
+      </w:r>
+    </w:p>
+    <w:p>
+      <w:pPr>
+        <w:spacing w:after="217" w:before="57" w:line="202" w:lineRule="auto"/>
+        <w:rPr>
+          <w:rFonts w:ascii="Courier New" w:cs="Courier New" w:eastAsia="Courier New" w:hAnsi="Courier New"/>
+        </w:rPr>
+      </w:pPr>
+      <w:r>
+        <w:rPr>
+          <w:rFonts w:ascii="Courier New" w:cs="Courier New" w:eastAsia="Courier New" w:hAnsi="Courier New"/>
+          <w:rtl w:val="0"/>
+        </w:rPr>
+        <w:t xml:space="preserve">        Stage stage = Utils.createDialog(owner, "Dialog 2");</w:t>
+      </w:r>
+    </w:p>
+    <w:p>
+      <w:pPr>
+        <w:spacing w:after="217" w:before="57" w:line="202" w:lineRule="auto"/>
+        <w:rPr>
+          <w:rFonts w:ascii="Courier New" w:cs="Courier New" w:eastAsia="Courier New" w:hAnsi="Courier New"/>
+        </w:rPr>
+      </w:pPr>
+      <w:r>
+        <w:rPr>
+          <w:rtl w:val="0"/>
+        </w:rPr>
+      </w:r>
+    </w:p>
+    <w:p>
+      <w:pPr>
+        <w:spacing w:after="217" w:before="57" w:line="202" w:lineRule="auto"/>
+        <w:rPr>
+          <w:rFonts w:ascii="Courier New" w:cs="Courier New" w:eastAsia="Courier New" w:hAnsi="Courier New"/>
+        </w:rPr>
+      </w:pPr>
+      <w:r>
+        <w:rPr>
+          <w:rFonts w:ascii="Courier New" w:cs="Courier New" w:eastAsia="Courier New" w:hAnsi="Courier New"/>
+          <w:rtl w:val="0"/>
+        </w:rPr>
+        <w:t xml:space="preserve">        Label label = new Label("Second dialog window");</w:t>
+      </w:r>
+    </w:p>
+    <w:p>
+      <w:pPr>
+        <w:spacing w:after="217" w:before="57" w:line="202" w:lineRule="auto"/>
+        <w:rPr>
+          <w:rFonts w:ascii="Courier New" w:cs="Courier New" w:eastAsia="Courier New" w:hAnsi="Courier New"/>
+        </w:rPr>
+      </w:pPr>
+      <w:r>
+        <w:rPr>
+          <w:rFonts w:ascii="Courier New" w:cs="Courier New" w:eastAsia="Courier New" w:hAnsi="Courier New"/>
+          <w:rtl w:val="0"/>
+        </w:rPr>
+        <w:t xml:space="preserve">        Button btnBack = new Button("&lt; Back");</w:t>
+      </w:r>
+    </w:p>
+    <w:p>
+      <w:pPr>
+        <w:spacing w:after="217" w:before="57" w:line="202" w:lineRule="auto"/>
+        <w:rPr>
+          <w:rFonts w:ascii="Courier New" w:cs="Courier New" w:eastAsia="Courier New" w:hAnsi="Courier New"/>
+        </w:rPr>
+      </w:pPr>
+      <w:r>
+        <w:rPr>
+          <w:rFonts w:ascii="Courier New" w:cs="Courier New" w:eastAsia="Courier New" w:hAnsi="Courier New"/>
+          <w:rtl w:val="0"/>
+        </w:rPr>
+        <w:t xml:space="preserve">        Button btnYes = new Button("Yes");</w:t>
+      </w:r>
+    </w:p>
+    <w:p>
+      <w:pPr>
+        <w:spacing w:after="217" w:before="57" w:line="202" w:lineRule="auto"/>
+        <w:rPr>
+          <w:rFonts w:ascii="Courier New" w:cs="Courier New" w:eastAsia="Courier New" w:hAnsi="Courier New"/>
+        </w:rPr>
+      </w:pPr>
+      <w:r>
+        <w:rPr>
+          <w:rFonts w:ascii="Courier New" w:cs="Courier New" w:eastAsia="Courier New" w:hAnsi="Courier New"/>
+          <w:rtl w:val="0"/>
+        </w:rPr>
+        <w:t xml:space="preserve">        Button btnCancel = new Button("Cancel");</w:t>
+      </w:r>
+    </w:p>
+    <w:p>
+      <w:pPr>
+        <w:spacing w:after="217" w:before="57" w:line="202" w:lineRule="auto"/>
+        <w:rPr>
+          <w:rFonts w:ascii="Courier New" w:cs="Courier New" w:eastAsia="Courier New" w:hAnsi="Courier New"/>
+        </w:rPr>
+      </w:pPr>
+      <w:r>
+        <w:rPr>
+          <w:rtl w:val="0"/>
+        </w:rPr>
+      </w:r>
+    </w:p>
+    <w:p>
+      <w:pPr>
+        <w:spacing w:after="217" w:before="57" w:line="202" w:lineRule="auto"/>
+        <w:rPr>
+          <w:rFonts w:ascii="Courier New" w:cs="Courier New" w:eastAsia="Courier New" w:hAnsi="Courier New"/>
+        </w:rPr>
+      </w:pPr>
+      <w:r>
+        <w:rPr>
+          <w:rFonts w:ascii="Courier New" w:cs="Courier New" w:eastAsia="Courier New" w:hAnsi="Courier New"/>
+          <w:rtl w:val="0"/>
+        </w:rPr>
+        <w:t xml:space="preserve">        btnBack.setOnAction(e -&gt; {</w:t>
+      </w:r>
+    </w:p>
+    <w:p>
+      <w:pPr>
+        <w:spacing w:after="217" w:before="57" w:line="202" w:lineRule="auto"/>
+        <w:rPr>
+          <w:rFonts w:ascii="Courier New" w:cs="Courier New" w:eastAsia="Courier New" w:hAnsi="Courier New"/>
+        </w:rPr>
+      </w:pPr>
+      <w:r>
+        <w:rPr>
+          <w:rFonts w:ascii="Courier New" w:cs="Courier New" w:eastAsia="Courier New" w:hAnsi="Courier New"/>
+          <w:rtl w:val="0"/>
+        </w:rPr>
+        <w:t xml:space="preserve">            stage.close();</w:t>
+      </w:r>
+    </w:p>
+    <w:p>
+      <w:pPr>
+        <w:spacing w:after="217" w:before="57" w:line="202" w:lineRule="auto"/>
+        <w:rPr>
+          <w:rFonts w:ascii="Courier New" w:cs="Courier New" w:eastAsia="Courier New" w:hAnsi="Courier New"/>
+        </w:rPr>
+      </w:pPr>
+      <w:r>
+        <w:rPr>
+          <w:rFonts w:ascii="Courier New" w:cs="Courier New" w:eastAsia="Courier New" w:hAnsi="Courier New"/>
+          <w:rtl w:val="0"/>
+        </w:rPr>
+        <w:t xml:space="preserve">            onBack.run();</w:t>
+      </w:r>
+    </w:p>
+    <w:p>
+      <w:pPr>
+        <w:spacing w:after="217" w:before="57" w:line="202" w:lineRule="auto"/>
+        <w:rPr>
+          <w:rFonts w:ascii="Courier New" w:cs="Courier New" w:eastAsia="Courier New" w:hAnsi="Courier New"/>
+        </w:rPr>
+      </w:pPr>
+      <w:r>
+        <w:rPr>
+          <w:rFonts w:ascii="Courier New" w:cs="Courier New" w:eastAsia="Courier New" w:hAnsi="Courier New"/>
+          <w:rtl w:val="0"/>
+        </w:rPr>
+        <w:t xml:space="preserve">        });</w:t>
+      </w:r>
+    </w:p>
+    <w:p>
+      <w:pPr>
+        <w:spacing w:after="217" w:before="57" w:line="202" w:lineRule="auto"/>
+        <w:rPr>
+          <w:rFonts w:ascii="Courier New" w:cs="Courier New" w:eastAsia="Courier New" w:hAnsi="Courier New"/>
+        </w:rPr>
+      </w:pPr>
+      <w:r>
+        <w:rPr>
+          <w:rFonts w:ascii="Courier New" w:cs="Courier New" w:eastAsia="Courier New" w:hAnsi="Courier New"/>
+          <w:rtl w:val="0"/>
+        </w:rPr>
+        <w:t xml:space="preserve">        btnYes.setOnAction(e -&gt; {</w:t>
+      </w:r>
+    </w:p>
+    <w:p>
+      <w:pPr>
+        <w:spacing w:after="217" w:before="57" w:line="202" w:lineRule="auto"/>
+        <w:rPr>
+          <w:rFonts w:ascii="Courier New" w:cs="Courier New" w:eastAsia="Courier New" w:hAnsi="Courier New"/>
+        </w:rPr>
+      </w:pPr>
+      <w:r>
+        <w:rPr>
+          <w:rFonts w:ascii="Courier New" w:cs="Courier New" w:eastAsia="Courier New" w:hAnsi="Courier New"/>
+          <w:rtl w:val="0"/>
+        </w:rPr>
+        <w:t xml:space="preserve">            callback.accept("Both dialog windows completed successfully!");</w:t>
+      </w:r>
+    </w:p>
+    <w:p>
+      <w:pPr>
+        <w:spacing w:after="217" w:before="57" w:line="202" w:lineRule="auto"/>
+        <w:rPr>
+          <w:rFonts w:ascii="Courier New" w:cs="Courier New" w:eastAsia="Courier New" w:hAnsi="Courier New"/>
+        </w:rPr>
+      </w:pPr>
+      <w:r>
+        <w:rPr>
+          <w:rFonts w:ascii="Courier New" w:cs="Courier New" w:eastAsia="Courier New" w:hAnsi="Courier New"/>
+          <w:rtl w:val="0"/>
+        </w:rPr>
+        <w:t xml:space="preserve">            stage.close();</w:t>
+      </w:r>
+    </w:p>
+    <w:p>
+      <w:pPr>
+        <w:spacing w:after="217" w:before="57" w:line="202" w:lineRule="auto"/>
+        <w:rPr>
+          <w:rFonts w:ascii="Courier New" w:cs="Courier New" w:eastAsia="Courier New" w:hAnsi="Courier New"/>
+        </w:rPr>
+      </w:pPr>
+      <w:r>
+        <w:rPr>
+          <w:rFonts w:ascii="Courier New" w:cs="Courier New" w:eastAsia="Courier New" w:hAnsi="Courier New"/>
+          <w:rtl w:val="0"/>
+        </w:rPr>
+        <w:t xml:space="preserve">        });</w:t>
+      </w:r>
+    </w:p>
+    <w:p>
+      <w:pPr>
+        <w:spacing w:after="217" w:before="57" w:line="202" w:lineRule="auto"/>
+        <w:rPr>
+          <w:rFonts w:ascii="Courier New" w:cs="Courier New" w:eastAsia="Courier New" w:hAnsi="Courier New"/>
+        </w:rPr>
+      </w:pPr>
+      <w:r>
+        <w:rPr>
+          <w:rFonts w:ascii="Courier New" w:cs="Courier New" w:eastAsia="Courier New" w:hAnsi="Courier New"/>
+          <w:rtl w:val="0"/>
+        </w:rPr>
+        <w:t xml:space="preserve">        btnCancel.setOnAction(e -&gt; stage.close());</w:t>
+      </w:r>
+    </w:p>
+    <w:p>
+      <w:pPr>
+        <w:spacing w:after="217" w:before="57" w:line="202" w:lineRule="auto"/>
+        <w:rPr>
+          <w:rFonts w:ascii="Courier New" w:cs="Courier New" w:eastAsia="Courier New" w:hAnsi="Courier New"/>
+        </w:rPr>
+      </w:pPr>
+      <w:r>
+        <w:rPr>
+          <w:rtl w:val="0"/>
+        </w:rPr>
+      </w:r>
+    </w:p>
+    <w:p>
+      <w:pPr>
+        <w:spacing w:after="217" w:before="57" w:line="202" w:lineRule="auto"/>
+        <w:rPr>
+          <w:rFonts w:ascii="Courier New" w:cs="Courier New" w:eastAsia="Courier New" w:hAnsi="Courier New"/>
+        </w:rPr>
+      </w:pPr>
+      <w:r>
+        <w:rPr>
+          <w:rFonts w:ascii="Courier New" w:cs="Courier New" w:eastAsia="Courier New" w:hAnsi="Courier New"/>
+          <w:rtl w:val="0"/>
+        </w:rPr>
+        <w:t xml:space="preserve">        Utils.showDialog(stage, Utils.dialogRoot(label, Utils.buttonRow(btnBack, btnYes, btnCancel)), 300, 150);</w:t>
+      </w:r>
+    </w:p>
+    <w:p>
+      <w:pPr>
+        <w:spacing w:after="217" w:before="57" w:line="202" w:lineRule="auto"/>
+        <w:rPr>
+          <w:rFonts w:ascii="Courier New" w:cs="Courier New" w:eastAsia="Courier New" w:hAnsi="Courier New"/>
+        </w:rPr>
+      </w:pPr>
+      <w:r>
+        <w:rPr>
+          <w:rFonts w:ascii="Courier New" w:cs="Courier New" w:eastAsia="Courier New" w:hAnsi="Courier New"/>
+          <w:rtl w:val="0"/>
+        </w:rPr>
+        <w:t xml:space="preserve">    }</w:t>
+      </w:r>
+    </w:p>
+    <w:p>
+      <w:pPr>
+        <w:spacing w:after="217" w:before="57" w:line="202" w:lineRule="auto"/>
+        <w:rPr>
+          <w:rFonts w:ascii="Courier New" w:cs="Courier New" w:eastAsia="Courier New" w:hAnsi="Courier New"/>
+        </w:rPr>
+      </w:pPr>
+      <w:r>
+        <w:rPr>
+          <w:rFonts w:ascii="Courier New" w:cs="Courier New" w:eastAsia="Courier New" w:hAnsi="Courier New"/>
+          <w:rtl w:val="0"/>
+        </w:rPr>
+        <w:t xml:space="preserve">}</w:t>
+      </w:r>
+    </w:p>
+    <w:p>
+      <w:pPr>
+        <w:spacing w:after="217" w:before="57" w:line="202" w:lineRule="auto"/>
+        <w:rPr>
+          <w:rFonts w:ascii="Courier New" w:cs="Courier New" w:eastAsia="Courier New" w:hAnsi="Courier New"/>
+        </w:rPr>
+      </w:pPr>
+      <w:r>
+        <w:rPr>
+          <w:rtl w:val="0"/>
+        </w:rPr>
+      </w:r>
+    </w:p>
+    <w:p>
+      <w:pPr>
+        <w:spacing w:after="217" w:before="0" w:line="259" w:lineRule="auto"/>
+        <w:ind w:left="0" w:right="0" w:firstLine="0"/>
+        <w:jc w:val="left"/>
         <w:rPr>
           <w:rFonts w:ascii="Times New Roman" w:cs="Times New Roman" w:eastAsia="Times New Roman" w:hAnsi="Times New Roman"/>
           <w:b w:val="1"/>
@@ -3415,6 +3444,16 @@
           <w:sz w:val="28"/>
           <w:szCs w:val="28"/>
           <w:u w:val="single"/>
+        </w:rPr>
+      </w:pPr>
+      <w:r>
+        <w:rPr>
+          <w:rFonts w:ascii="Times New Roman" w:cs="Times New Roman" w:eastAsia="Times New Roman" w:hAnsi="Times New Roman"/>
+          <w:b w:val="1"/>
+          <w:bCs w:val="1"/>
+          <w:sz w:val="28"/>
+          <w:szCs w:val="28"/>
+          <w:u w:val="single"/>
           <w:rtl w:val="0"/>
         </w:rPr>
         <w:t xml:space="preserve">Utils.java</w:t>
@@ -4003,6 +4042,366 @@
           <w:rtl w:val="0"/>
         </w:rPr>
         <w:t xml:space="preserve">}</w:t>
+      </w:r>
+    </w:p>
+    <w:p>
+      <w:pPr>
+        <w:spacing w:after="217" w:before="57" w:line="202" w:lineRule="auto"/>
+        <w:ind w:left="0" w:right="0" w:firstLine="0"/>
+        <w:jc w:val="left"/>
+        <w:rPr>
+          <w:rFonts w:ascii="Times New Roman" w:cs="Times New Roman" w:eastAsia="Times New Roman" w:hAnsi="Times New Roman"/>
+          <w:sz w:val="32"/>
+          <w:szCs w:val="32"/>
+          <w:u w:val="single"/>
+        </w:rPr>
+      </w:pPr>
+      <w:r>
+        <w:rPr>
+          <w:rtl w:val="0"/>
+        </w:rPr>
+      </w:r>
+    </w:p>
+    <w:p>
+      <w:pPr>
+        <w:spacing w:after="217" w:before="57" w:line="202" w:lineRule="auto"/>
+        <w:ind w:left="0" w:right="0" w:firstLine="0"/>
+        <w:jc w:val="left"/>
+        <w:rPr>
+          <w:rFonts w:ascii="Times New Roman" w:cs="Times New Roman" w:eastAsia="Times New Roman" w:hAnsi="Times New Roman"/>
+          <w:sz w:val="32"/>
+          <w:szCs w:val="32"/>
+          <w:u w:val="single"/>
+        </w:rPr>
+      </w:pPr>
+      <w:r>
+        <w:rPr>
+          <w:rtl w:val="0"/>
+        </w:rPr>
+      </w:r>
+    </w:p>
+    <w:p>
+      <w:pPr>
+        <w:spacing w:after="217" w:before="57" w:line="202" w:lineRule="auto"/>
+        <w:ind w:left="0" w:right="0" w:firstLine="0"/>
+        <w:jc w:val="left"/>
+        <w:rPr>
+          <w:rFonts w:ascii="Times New Roman" w:cs="Times New Roman" w:eastAsia="Times New Roman" w:hAnsi="Times New Roman"/>
+          <w:sz w:val="32"/>
+          <w:szCs w:val="32"/>
+          <w:u w:val="single"/>
+        </w:rPr>
+      </w:pPr>
+      <w:r>
+        <w:rPr>
+          <w:rtl w:val="0"/>
+        </w:rPr>
+      </w:r>
+    </w:p>
+    <w:p>
+      <w:pPr>
+        <w:spacing w:after="217" w:before="57" w:line="202" w:lineRule="auto"/>
+        <w:ind w:left="0" w:right="0" w:firstLine="0"/>
+        <w:jc w:val="left"/>
+        <w:rPr>
+          <w:rFonts w:ascii="Times New Roman" w:cs="Times New Roman" w:eastAsia="Times New Roman" w:hAnsi="Times New Roman"/>
+          <w:sz w:val="32"/>
+          <w:szCs w:val="32"/>
+          <w:u w:val="single"/>
+        </w:rPr>
+      </w:pPr>
+      <w:r>
+        <w:rPr>
+          <w:rtl w:val="0"/>
+        </w:rPr>
+      </w:r>
+    </w:p>
+    <w:p>
+      <w:pPr>
+        <w:spacing w:after="217" w:before="57" w:line="202" w:lineRule="auto"/>
+        <w:ind w:left="0" w:right="0" w:firstLine="0"/>
+        <w:jc w:val="left"/>
+        <w:rPr>
+          <w:rFonts w:ascii="Times New Roman" w:cs="Times New Roman" w:eastAsia="Times New Roman" w:hAnsi="Times New Roman"/>
+          <w:sz w:val="32"/>
+          <w:szCs w:val="32"/>
+          <w:u w:val="single"/>
+        </w:rPr>
+      </w:pPr>
+      <w:r>
+        <w:rPr>
+          <w:rtl w:val="0"/>
+        </w:rPr>
+      </w:r>
+    </w:p>
+    <w:p>
+      <w:pPr>
+        <w:spacing w:after="217" w:before="57" w:line="202" w:lineRule="auto"/>
+        <w:ind w:left="0" w:right="0" w:firstLine="0"/>
+        <w:jc w:val="left"/>
+        <w:rPr>
+          <w:rFonts w:ascii="Times New Roman" w:cs="Times New Roman" w:eastAsia="Times New Roman" w:hAnsi="Times New Roman"/>
+          <w:sz w:val="32"/>
+          <w:szCs w:val="32"/>
+          <w:u w:val="single"/>
+        </w:rPr>
+      </w:pPr>
+      <w:r>
+        <w:rPr>
+          <w:rtl w:val="0"/>
+        </w:rPr>
+      </w:r>
+    </w:p>
+    <w:p>
+      <w:pPr>
+        <w:spacing w:after="217" w:before="57" w:line="202" w:lineRule="auto"/>
+        <w:ind w:left="0" w:right="0" w:firstLine="0"/>
+        <w:jc w:val="left"/>
+        <w:rPr>
+          <w:rFonts w:ascii="Times New Roman" w:cs="Times New Roman" w:eastAsia="Times New Roman" w:hAnsi="Times New Roman"/>
+          <w:sz w:val="32"/>
+          <w:szCs w:val="32"/>
+          <w:u w:val="single"/>
+        </w:rPr>
+      </w:pPr>
+      <w:r>
+        <w:rPr>
+          <w:rtl w:val="0"/>
+        </w:rPr>
+      </w:r>
+    </w:p>
+    <w:p>
+      <w:pPr>
+        <w:spacing w:after="217" w:before="57" w:line="202" w:lineRule="auto"/>
+        <w:ind w:left="0" w:right="0" w:firstLine="0"/>
+        <w:jc w:val="left"/>
+        <w:rPr>
+          <w:rFonts w:ascii="Times New Roman" w:cs="Times New Roman" w:eastAsia="Times New Roman" w:hAnsi="Times New Roman"/>
+          <w:sz w:val="32"/>
+          <w:szCs w:val="32"/>
+          <w:u w:val="single"/>
+        </w:rPr>
+      </w:pPr>
+      <w:r>
+        <w:rPr>
+          <w:rtl w:val="0"/>
+        </w:rPr>
+      </w:r>
+    </w:p>
+    <w:p>
+      <w:pPr>
+        <w:spacing w:after="217" w:before="57" w:line="202" w:lineRule="auto"/>
+        <w:ind w:left="0" w:right="0" w:firstLine="0"/>
+        <w:jc w:val="left"/>
+        <w:rPr>
+          <w:rFonts w:ascii="Times New Roman" w:cs="Times New Roman" w:eastAsia="Times New Roman" w:hAnsi="Times New Roman"/>
+          <w:sz w:val="32"/>
+          <w:szCs w:val="32"/>
+          <w:u w:val="single"/>
+        </w:rPr>
+      </w:pPr>
+      <w:r>
+        <w:rPr>
+          <w:rtl w:val="0"/>
+        </w:rPr>
+      </w:r>
+    </w:p>
+    <w:p>
+      <w:pPr>
+        <w:spacing w:after="217" w:before="57" w:line="202" w:lineRule="auto"/>
+        <w:ind w:left="0" w:right="0" w:firstLine="0"/>
+        <w:jc w:val="left"/>
+        <w:rPr>
+          <w:rFonts w:ascii="Times New Roman" w:cs="Times New Roman" w:eastAsia="Times New Roman" w:hAnsi="Times New Roman"/>
+          <w:sz w:val="32"/>
+          <w:szCs w:val="32"/>
+          <w:u w:val="single"/>
+        </w:rPr>
+      </w:pPr>
+      <w:r>
+        <w:rPr>
+          <w:rtl w:val="0"/>
+        </w:rPr>
+      </w:r>
+    </w:p>
+    <w:p>
+      <w:pPr>
+        <w:spacing w:after="217" w:before="57" w:line="202" w:lineRule="auto"/>
+        <w:ind w:left="0" w:right="0" w:firstLine="0"/>
+        <w:jc w:val="left"/>
+        <w:rPr>
+          <w:rFonts w:ascii="Times New Roman" w:cs="Times New Roman" w:eastAsia="Times New Roman" w:hAnsi="Times New Roman"/>
+          <w:sz w:val="32"/>
+          <w:szCs w:val="32"/>
+          <w:u w:val="single"/>
+        </w:rPr>
+      </w:pPr>
+      <w:r>
+        <w:rPr>
+          <w:rtl w:val="0"/>
+        </w:rPr>
+      </w:r>
+    </w:p>
+    <w:p>
+      <w:pPr>
+        <w:spacing w:after="217" w:before="57" w:line="202" w:lineRule="auto"/>
+        <w:ind w:left="0" w:right="0" w:firstLine="0"/>
+        <w:jc w:val="left"/>
+        <w:rPr>
+          <w:rFonts w:ascii="Times New Roman" w:cs="Times New Roman" w:eastAsia="Times New Roman" w:hAnsi="Times New Roman"/>
+          <w:sz w:val="32"/>
+          <w:szCs w:val="32"/>
+          <w:u w:val="single"/>
+        </w:rPr>
+      </w:pPr>
+      <w:r>
+        <w:rPr>
+          <w:rtl w:val="0"/>
+        </w:rPr>
+      </w:r>
+    </w:p>
+    <w:p>
+      <w:pPr>
+        <w:spacing w:after="217" w:before="57" w:line="202" w:lineRule="auto"/>
+        <w:ind w:left="0" w:right="0" w:firstLine="0"/>
+        <w:jc w:val="left"/>
+        <w:rPr>
+          <w:rFonts w:ascii="Times New Roman" w:cs="Times New Roman" w:eastAsia="Times New Roman" w:hAnsi="Times New Roman"/>
+          <w:sz w:val="32"/>
+          <w:szCs w:val="32"/>
+          <w:u w:val="single"/>
+        </w:rPr>
+      </w:pPr>
+      <w:r>
+        <w:rPr>
+          <w:rtl w:val="0"/>
+        </w:rPr>
+      </w:r>
+    </w:p>
+    <w:p>
+      <w:pPr>
+        <w:spacing w:after="217" w:before="57" w:line="202" w:lineRule="auto"/>
+        <w:ind w:left="0" w:right="0" w:firstLine="0"/>
+        <w:jc w:val="left"/>
+        <w:rPr>
+          <w:rFonts w:ascii="Times New Roman" w:cs="Times New Roman" w:eastAsia="Times New Roman" w:hAnsi="Times New Roman"/>
+          <w:sz w:val="32"/>
+          <w:szCs w:val="32"/>
+          <w:u w:val="single"/>
+        </w:rPr>
+      </w:pPr>
+      <w:r>
+        <w:rPr>
+          <w:rtl w:val="0"/>
+        </w:rPr>
+      </w:r>
+    </w:p>
+    <w:p>
+      <w:pPr>
+        <w:spacing w:after="217" w:before="57" w:line="202" w:lineRule="auto"/>
+        <w:ind w:left="0" w:right="0" w:firstLine="0"/>
+        <w:jc w:val="left"/>
+        <w:rPr>
+          <w:rFonts w:ascii="Times New Roman" w:cs="Times New Roman" w:eastAsia="Times New Roman" w:hAnsi="Times New Roman"/>
+          <w:sz w:val="32"/>
+          <w:szCs w:val="32"/>
+          <w:u w:val="single"/>
+        </w:rPr>
+      </w:pPr>
+      <w:r>
+        <w:rPr>
+          <w:rtl w:val="0"/>
+        </w:rPr>
+      </w:r>
+    </w:p>
+    <w:p>
+      <w:pPr>
+        <w:spacing w:after="217" w:before="57" w:line="202" w:lineRule="auto"/>
+        <w:ind w:left="0" w:right="0" w:firstLine="0"/>
+        <w:jc w:val="left"/>
+        <w:rPr>
+          <w:rFonts w:ascii="Times New Roman" w:cs="Times New Roman" w:eastAsia="Times New Roman" w:hAnsi="Times New Roman"/>
+          <w:sz w:val="32"/>
+          <w:szCs w:val="32"/>
+          <w:u w:val="single"/>
+        </w:rPr>
+      </w:pPr>
+      <w:r>
+        <w:rPr>
+          <w:rtl w:val="0"/>
+        </w:rPr>
+      </w:r>
+    </w:p>
+    <w:p>
+      <w:pPr>
+        <w:spacing w:after="217" w:before="57" w:line="202" w:lineRule="auto"/>
+        <w:ind w:left="0" w:right="0" w:firstLine="0"/>
+        <w:jc w:val="left"/>
+        <w:rPr>
+          <w:rFonts w:ascii="Times New Roman" w:cs="Times New Roman" w:eastAsia="Times New Roman" w:hAnsi="Times New Roman"/>
+          <w:sz w:val="32"/>
+          <w:szCs w:val="32"/>
+          <w:u w:val="single"/>
+        </w:rPr>
+      </w:pPr>
+      <w:r>
+        <w:rPr>
+          <w:rtl w:val="0"/>
+        </w:rPr>
+      </w:r>
+    </w:p>
+    <w:p>
+      <w:pPr>
+        <w:spacing w:after="217" w:before="57" w:line="202" w:lineRule="auto"/>
+        <w:ind w:left="0" w:right="0" w:firstLine="0"/>
+        <w:jc w:val="left"/>
+        <w:rPr>
+          <w:rFonts w:ascii="Times New Roman" w:cs="Times New Roman" w:eastAsia="Times New Roman" w:hAnsi="Times New Roman"/>
+          <w:sz w:val="32"/>
+          <w:szCs w:val="32"/>
+          <w:u w:val="single"/>
+        </w:rPr>
+      </w:pPr>
+      <w:r>
+        <w:rPr>
+          <w:rtl w:val="0"/>
+        </w:rPr>
+      </w:r>
+    </w:p>
+    <w:p>
+      <w:pPr>
+        <w:spacing w:after="217" w:before="57" w:line="202" w:lineRule="auto"/>
+        <w:ind w:left="0" w:right="0" w:firstLine="0"/>
+        <w:jc w:val="left"/>
+        <w:rPr>
+          <w:rFonts w:ascii="Times New Roman" w:cs="Times New Roman" w:eastAsia="Times New Roman" w:hAnsi="Times New Roman"/>
+          <w:sz w:val="32"/>
+          <w:szCs w:val="32"/>
+          <w:u w:val="single"/>
+        </w:rPr>
+      </w:pPr>
+      <w:r>
+        <w:rPr>
+          <w:rtl w:val="0"/>
+        </w:rPr>
+      </w:r>
+    </w:p>
+    <w:p>
+      <w:pPr>
+        <w:spacing w:after="217" w:before="57" w:line="202" w:lineRule="auto"/>
+        <w:ind w:left="0" w:right="0" w:firstLine="0"/>
+        <w:jc w:val="left"/>
+        <w:rPr>
+          <w:rFonts w:ascii="Times New Roman" w:cs="Times New Roman" w:eastAsia="Times New Roman" w:hAnsi="Times New Roman"/>
+          <w:sz w:val="32"/>
+          <w:szCs w:val="32"/>
+          <w:u w:val="single"/>
+        </w:rPr>
+      </w:pPr>
+      <w:r>
+        <w:rPr>
+          <w:rtl w:val="0"/>
+        </w:rPr>
       </w:r>
     </w:p>
     <w:p>
@@ -4068,12 +4467,12 @@
             <wp:extent cx="2947988" cy="2550243"/>
             <wp:effectExtent b="0" l="0" r="0" t="0"/>
             <wp:wrapNone/>
-            <wp:docPr id="11" name="image1.png"/>
+            <wp:docPr id="11" name="image2.png"/>
             <a:graphic>
               <a:graphicData uri="http://schemas.openxmlformats.org/drawingml/2006/picture">
                 <pic:pic>
                   <pic:nvPicPr>
-                    <pic:cNvPr id="0" name="image1.png"/>
+                    <pic:cNvPr id="0" name="image2.png"/>
                     <pic:cNvPicPr preferRelativeResize="0"/>
                   </pic:nvPicPr>
                   <pic:blipFill>
@@ -4129,12 +4528,12 @@
             <wp:extent cx="2786063" cy="2318723"/>
             <wp:effectExtent b="0" l="0" r="0" t="0"/>
             <wp:wrapNone/>
-            <wp:docPr id="9" name="image2.png"/>
+            <wp:docPr id="8" name="image6.png"/>
             <a:graphic>
               <a:graphicData uri="http://schemas.openxmlformats.org/drawingml/2006/picture">
                 <pic:pic>
                   <pic:nvPicPr>
-                    <pic:cNvPr id="0" name="image2.png"/>
+                    <pic:cNvPr id="0" name="image6.png"/>
                     <pic:cNvPicPr preferRelativeResize="0"/>
                   </pic:nvPicPr>
                   <pic:blipFill>
@@ -4193,12 +4592,12 @@
             <wp:extent cx="2790825" cy="2379546"/>
             <wp:effectExtent b="0" l="0" r="0" t="0"/>
             <wp:wrapNone/>
-            <wp:docPr id="12" name="image3.png"/>
+            <wp:docPr id="12" name="image7.png"/>
             <a:graphic>
               <a:graphicData uri="http://schemas.openxmlformats.org/drawingml/2006/picture">
                 <pic:pic>
                   <pic:nvPicPr>
-                    <pic:cNvPr id="0" name="image3.png"/>
+                    <pic:cNvPr id="0" name="image7.png"/>
                     <pic:cNvPicPr preferRelativeResize="0"/>
                   </pic:nvPicPr>
                   <pic:blipFill>
@@ -4235,12 +4634,12 @@
             <wp:extent cx="2790825" cy="2343857"/>
             <wp:effectExtent b="0" l="0" r="0" t="0"/>
             <wp:wrapNone/>
-            <wp:docPr id="13" name="image6.png"/>
+            <wp:docPr id="13" name="image1.png"/>
             <a:graphic>
               <a:graphicData uri="http://schemas.openxmlformats.org/drawingml/2006/picture">
                 <pic:pic>
                   <pic:nvPicPr>
-                    <pic:cNvPr id="0" name="image6.png"/>
+                    <pic:cNvPr id="0" name="image1.png"/>
                     <pic:cNvPicPr preferRelativeResize="0"/>
                   </pic:nvPicPr>
                   <pic:blipFill>
@@ -4277,12 +4676,12 @@
             <wp:extent cx="2790825" cy="2421179"/>
             <wp:effectExtent b="0" l="0" r="0" t="0"/>
             <wp:wrapNone/>
-            <wp:docPr id="10" name="image4.png"/>
+            <wp:docPr id="9" name="image5.png"/>
             <a:graphic>
               <a:graphicData uri="http://schemas.openxmlformats.org/drawingml/2006/picture">
                 <pic:pic>
                   <pic:nvPicPr>
-                    <pic:cNvPr id="0" name="image4.png"/>
+                    <pic:cNvPr id="0" name="image5.png"/>
                     <pic:cNvPicPr preferRelativeResize="0"/>
                   </pic:nvPicPr>
                   <pic:blipFill>
@@ -4319,12 +4718,12 @@
             <wp:extent cx="2790825" cy="2392136"/>
             <wp:effectExtent b="0" l="0" r="0" t="0"/>
             <wp:wrapNone/>
-            <wp:docPr id="14" name="image7.png"/>
+            <wp:docPr id="14" name="image4.png"/>
             <a:graphic>
               <a:graphicData uri="http://schemas.openxmlformats.org/drawingml/2006/picture">
                 <pic:pic>
                   <pic:nvPicPr>
-                    <pic:cNvPr id="0" name="image7.png"/>
+                    <pic:cNvPr id="0" name="image4.png"/>
                     <pic:cNvPicPr preferRelativeResize="0"/>
                   </pic:nvPicPr>
                   <pic:blipFill>
@@ -4393,34 +4792,17 @@
           <w:szCs w:val="32"/>
           <w:u w:val="single"/>
           <w:shd w:fill="auto" w:val="clear"/>
-          <w:rtl w:val="0"/>
-        </w:rPr>
-        <w:t xml:space="preserve">Висновки:</w:t>
-      </w:r>
-      <w:r>
-        <w:rPr>
-          <w:rtl w:val="0"/>
-        </w:rPr>
-      </w:r>
-      <w:r>
+        </w:rPr>
         <w:drawing>
-          <wp:anchor allowOverlap="1" behindDoc="0" distB="114300" distT="114300" distL="114300" distR="114300" hidden="0" layoutInCell="1" locked="0" relativeHeight="0" simplePos="0">
-            <wp:simplePos x="0" y="0"/>
-            <wp:positionH relativeFrom="column">
-              <wp:posOffset>857250</wp:posOffset>
-            </wp:positionH>
-            <wp:positionV relativeFrom="paragraph">
-              <wp:posOffset>238125</wp:posOffset>
-            </wp:positionV>
-            <wp:extent cx="4329113" cy="2614089"/>
+          <wp:inline distB="114300" distT="114300" distL="114300" distR="114300">
+            <wp:extent cx="5943600" cy="2755900"/>
             <wp:effectExtent b="0" l="0" r="0" t="0"/>
-            <wp:wrapTopAndBottom distB="114300" distT="114300"/>
-            <wp:docPr id="8" name="image5.png"/>
+            <wp:docPr id="10" name="image3.png"/>
             <a:graphic>
               <a:graphicData uri="http://schemas.openxmlformats.org/drawingml/2006/picture">
                 <pic:pic>
                   <pic:nvPicPr>
-                    <pic:cNvPr id="0" name="image5.png"/>
+                    <pic:cNvPr id="0" name="image3.png"/>
                     <pic:cNvPicPr preferRelativeResize="0"/>
                   </pic:nvPicPr>
                   <pic:blipFill>
@@ -4433,7 +4815,7 @@
                   <pic:spPr>
                     <a:xfrm>
                       <a:off x="0" y="0"/>
-                      <a:ext cx="4329113" cy="2614089"/>
+                      <a:ext cx="5943600" cy="2755900"/>
                     </a:xfrm>
                     <a:prstGeom prst="rect"/>
                     <a:ln/>
@@ -4441,8 +4823,13 @@
                 </pic:pic>
               </a:graphicData>
             </a:graphic>
-          </wp:anchor>
+          </wp:inline>
         </w:drawing>
+      </w:r>
+      <w:r>
+        <w:rPr>
+          <w:rtl w:val="0"/>
+        </w:rPr>
       </w:r>
     </w:p>
     <w:p>
@@ -4465,7 +4852,7 @@
           <w:u w:val="single"/>
           <w:rtl w:val="0"/>
         </w:rPr>
-        <w:t xml:space="preserve">У лабораторній роботі я виконала завдання згідно свого варіанту: створила програму з головним вікном, меню та двома діалоговими вікнами.</w:t>
+        <w:t xml:space="preserve">Висновки:</w:t>
       </w:r>
     </w:p>
     <w:p>
@@ -4477,7 +4864,6 @@
           <w:rFonts w:ascii="Times New Roman" w:cs="Times New Roman" w:eastAsia="Times New Roman" w:hAnsi="Times New Roman"/>
           <w:sz w:val="32"/>
           <w:szCs w:val="32"/>
-          <w:u w:val="single"/>
         </w:rPr>
       </w:pPr>
       <w:r>
@@ -4485,7 +4871,27 @@
           <w:rFonts w:ascii="Times New Roman" w:cs="Times New Roman" w:eastAsia="Times New Roman" w:hAnsi="Times New Roman"/>
           <w:sz w:val="32"/>
           <w:szCs w:val="32"/>
-          <w:u w:val="single"/>
+          <w:rtl w:val="0"/>
+        </w:rPr>
+        <w:t xml:space="preserve">У лабораторній роботі я виконала завдання згідно свого варіанту: створила програму з головним вікном, меню та двома діалоговими вікнами.</w:t>
+      </w:r>
+    </w:p>
+    <w:p>
+      <w:pPr>
+        <w:spacing w:after="160" w:before="0" w:line="259" w:lineRule="auto"/>
+        <w:ind w:left="0" w:right="0" w:firstLine="0"/>
+        <w:jc w:val="left"/>
+        <w:rPr>
+          <w:rFonts w:ascii="Times New Roman" w:cs="Times New Roman" w:eastAsia="Times New Roman" w:hAnsi="Times New Roman"/>
+          <w:sz w:val="32"/>
+          <w:szCs w:val="32"/>
+        </w:rPr>
+      </w:pPr>
+      <w:r>
+        <w:rPr>
+          <w:rFonts w:ascii="Times New Roman" w:cs="Times New Roman" w:eastAsia="Times New Roman" w:hAnsi="Times New Roman"/>
+          <w:sz w:val="32"/>
+          <w:szCs w:val="32"/>
           <w:rtl w:val="0"/>
         </w:rPr>
         <w:t xml:space="preserve">Ця робота дала мені перші практичні навички створення графічних програм на JavaFX і модульного програмування. Я навчилася будувати меню та обробляти події вибору пунктів, створювати діалогові вікна з різними елементами керування (повзунок, кнопки) і передавати результат у головне вікно через callback-функцію, не роблячи логіку діалогу доступною ззовні. Окремо я попрацювала над розподілом коду по модулях: кожен діалог живе у власному класі, а спільні допоміжні методи винесені в Utils, щоб модулі не залежали один від одного й не дублювали код. Також я розібралася зі збіркою проєкту через Gradle та підключенням бібліотеки JavaFX.</w:t>

</xml_diff>